<commit_message>
Add independent module inputs and safe failed-task recovery with fresh-page navigation
</commit_message>
<xml_diff>
--- a/docs/USER_GUIDE.docx
+++ b/docs/USER_GUIDE.docx
@@ -798,7 +798,7 @@
         <w:t xml:space="preserve"> </w:t>
       </w:r>
       <w:r>
-        <w:t xml:space="preserve">中。浏览器可能记得旧路径，可点击“使用部署默认目录”；这不会搬迁旧结果。历史数据通过“打开历史批次”选择原 run。默认环境分别为</w:t>
+        <w:t xml:space="preserve">中。每次刷新或重新打开页面，默认新建空白批次，不自动带入上次测序、分组、分类器、数据库或结果路径；部署默认输出目录会明确填入。软件环境名与作图偏好可以保留。左侧导航包含各分析区和“任务进度”，窄屏改为顶部横向导航。默认环境分别为</w:t>
       </w:r>
       <w:r>
         <w:t xml:space="preserve"> </w:t>
@@ -847,6 +847,14 @@
       </w:r>
       <w:r>
         <w:t xml:space="preserve">，可按本机实际名称修改。环境名存在不代表相应命令和依赖已安装。</w:t>
+      </w:r>
+    </w:p>
+    <w:p>
+      <w:pPr>
+        <w:pStyle w:val="BodyText"/>
+      </w:pPr>
+      <w:r>
+        <w:t xml:space="preserve">刷新不会停止后台任务。页面可在保持输入空白的同时监看正在运行的任务；已有分析从“任务进度”的最近任务或“打开历史批次”明确打开，再恢复其路径和参数。</w:t>
       </w:r>
     </w:p>
     <w:p>
@@ -3332,7 +3340,39 @@
         <w:pStyle w:val="FirstParagraph"/>
       </w:pPr>
       <w:r>
-        <w:t xml:space="preserve">每次任务创建独立 run，不覆盖原始 FASTQ 或旧分析。新建批次清除旧批次关联，保留常用软件和作图偏好；历史入口明确恢复相同来源下的完整结果。修改样本、分组或引物后，不能继续把旧质量结果当作新输入。失败的部分结果保留供诊断，但工作站不是任意步骤自动断点续跑工具。</w:t>
+        <w:t xml:space="preserve">每次任务创建独立 run，不覆盖原始 FASTQ 或旧分析。刷新、重新打开页面或新建批次会清除旧路径关联，保留常用软件和作图偏好；路径只在明确打开历史或失败任务时恢复。修改样本、分组或引物后，不能继续把旧质量结果当作新输入。</w:t>
+      </w:r>
+    </w:p>
+    <w:p>
+      <w:pPr>
+        <w:pStyle w:val="BodyText"/>
+      </w:pPr>
+      <w:r>
+        <w:rPr>
+          <w:b/>
+          <w:bCs/>
+        </w:rPr>
+        <w:t xml:space="preserve">后续模块独立运行</w:t>
+      </w:r>
+      <w:r>
+        <w:t xml:space="preserve">：多样性、丰度导出、差异菌、LEfSe、功能预测和高级分析各有“本模块输入来源”。完整流程完成预处理后会自动填入这些入口；也可只选择本模块的历史任务直接分析，无需重新填写 FASTQ。选择一个模块的来源不自动替换其他模块输入。</w:t>
+      </w:r>
+    </w:p>
+    <w:p>
+      <w:pPr>
+        <w:pStyle w:val="BodyText"/>
+      </w:pPr>
+      <w:r>
+        <w:t xml:space="preserve">“</w:t>
+      </w:r>
+      <w:r>
+        <w:t xml:space="preserve">外部 QZA／丰度表</w:t>
+      </w:r>
+      <w:r>
+        <w:t xml:space="preserve">”</w:t>
+      </w:r>
+      <w:r>
+        <w:t xml:space="preserve">支持其他流程的已有结果，按模块准备独立输入任务：</w:t>
       </w:r>
     </w:p>
     <w:tbl>
@@ -3359,19 +3399,19 @@
               <w:jc w:val="left"/>
             </w:pPr>
             <w:r>
-              <w:t xml:space="preserve">位置或文件</w:t>
-            </w:r>
-          </w:p>
-        </w:tc>
-        <w:tc>
-          <w:tcPr/>
-          <w:p>
-            <w:pPr>
-              <w:pStyle w:val="Compact"/>
-              <w:jc w:val="left"/>
-            </w:pPr>
-            <w:r>
-              <w:t xml:space="preserve">用途</w:t>
+              <w:t xml:space="preserve">模块</w:t>
+            </w:r>
+          </w:p>
+        </w:tc>
+        <w:tc>
+          <w:tcPr/>
+          <w:p>
+            <w:pPr>
+              <w:pStyle w:val="Compact"/>
+              <w:jc w:val="left"/>
+            </w:pPr>
+            <w:r>
+              <w:t xml:space="preserve">必需外部输入（均另需 SampleID,Group CSV）</w:t>
             </w:r>
           </w:p>
         </w:tc>
@@ -3385,25 +3425,19 @@
               <w:jc w:val="left"/>
             </w:pPr>
             <w:r>
-              <w:rPr>
-                <w:rStyle w:val="VerbatimChar"/>
-              </w:rPr>
-              <w:t xml:space="preserve">00_inputs</w:t>
-            </w:r>
-            <w:r>
-              <w:t xml:space="preserve">、manifest、metadata</w:t>
-            </w:r>
-          </w:p>
-        </w:tc>
-        <w:tc>
-          <w:tcPr/>
-          <w:p>
-            <w:pPr>
-              <w:pStyle w:val="Compact"/>
-              <w:jc w:val="left"/>
-            </w:pPr>
-            <w:r>
-              <w:t xml:space="preserve">实际文件映射、分组与输入来源</w:t>
+              <w:t xml:space="preserve">多样性</w:t>
+            </w:r>
+          </w:p>
+        </w:tc>
+        <w:tc>
+          <w:tcPr/>
+          <w:p>
+            <w:pPr>
+              <w:pStyle w:val="Compact"/>
+              <w:jc w:val="left"/>
+            </w:pPr>
+            <w:r>
+              <w:t xml:space="preserve">未抽平计数 QZA/TSV/CSV＋Rooted tree QZA；本模块包含 Faith PD/UniFrac，不能缺树</w:t>
             </w:r>
           </w:p>
         </w:tc>
@@ -3417,31 +3451,19 @@
               <w:jc w:val="left"/>
             </w:pPr>
             <w:r>
-              <w:rPr>
-                <w:rStyle w:val="VerbatimChar"/>
-              </w:rPr>
-              <w:t xml:space="preserve">01_import</w:t>
-            </w:r>
-            <w:r>
-              <w:t xml:space="preserve">、</w:t>
-            </w:r>
-            <w:r>
-              <w:rPr>
-                <w:rStyle w:val="VerbatimChar"/>
-              </w:rPr>
-              <w:t xml:space="preserve">02_primers</w:t>
-            </w:r>
-          </w:p>
-        </w:tc>
-        <w:tc>
-          <w:tcPr/>
-          <w:p>
-            <w:pPr>
-              <w:pStyle w:val="Compact"/>
-              <w:jc w:val="left"/>
-            </w:pPr>
-            <w:r>
-              <w:t xml:space="preserve">导入、质量图、清洗后 FASTQ 与残留检查</w:t>
+              <w:t xml:space="preserve">丰度导出</w:t>
+            </w:r>
+          </w:p>
+        </w:tc>
+        <w:tc>
+          <w:tcPr/>
+          <w:p>
+            <w:pPr>
+              <w:pStyle w:val="Compact"/>
+              <w:jc w:val="left"/>
+            </w:pPr>
+            <w:r>
+              <w:t xml:space="preserve">未抽平计数＋对应 Taxonomy QZA/TSV</w:t>
             </w:r>
           </w:p>
         </w:tc>
@@ -3455,31 +3477,19 @@
               <w:jc w:val="left"/>
             </w:pPr>
             <w:r>
-              <w:rPr>
-                <w:rStyle w:val="VerbatimChar"/>
-              </w:rPr>
-              <w:t xml:space="preserve">03_dada2</w:t>
-            </w:r>
-            <w:r>
-              <w:t xml:space="preserve">、</w:t>
-            </w:r>
-            <w:r>
-              <w:rPr>
-                <w:rStyle w:val="VerbatimChar"/>
-              </w:rPr>
-              <w:t xml:space="preserve">04_taxonomy_filter</w:t>
-            </w:r>
-          </w:p>
-        </w:tc>
-        <w:tc>
-          <w:tcPr/>
-          <w:p>
-            <w:pPr>
-              <w:pStyle w:val="Compact"/>
-              <w:jc w:val="left"/>
-            </w:pPr>
-            <w:r>
-              <w:t xml:space="preserve">完整 ASV 表、代表序列、降噪统计、分类和过滤表</w:t>
+              <w:t xml:space="preserve">ANCOM/LEfSe</w:t>
+            </w:r>
+          </w:p>
+        </w:tc>
+        <w:tc>
+          <w:tcPr/>
+          <w:p>
+            <w:pPr>
+              <w:pStyle w:val="Compact"/>
+              <w:jc w:val="left"/>
+            </w:pPr>
+            <w:r>
+              <w:t xml:space="preserve">未抽平计数＋对应 Taxonomy QZA/TSV；参考组、方法和阈值在各自分析区设置</w:t>
             </w:r>
           </w:p>
         </w:tc>
@@ -3493,31 +3503,19 @@
               <w:jc w:val="left"/>
             </w:pPr>
             <w:r>
-              <w:rPr>
-                <w:rStyle w:val="VerbatimChar"/>
-              </w:rPr>
-              <w:t xml:space="preserve">05_phylogeny</w:t>
-            </w:r>
-            <w:r>
-              <w:t xml:space="preserve">、</w:t>
-            </w:r>
-            <w:r>
-              <w:rPr>
-                <w:rStyle w:val="VerbatimChar"/>
-              </w:rPr>
-              <w:t xml:space="preserve">06_rarefaction</w:t>
-            </w:r>
-          </w:p>
-        </w:tc>
-        <w:tc>
-          <w:tcPr/>
-          <w:p>
-            <w:pPr>
-              <w:pStyle w:val="Compact"/>
-              <w:jc w:val="left"/>
-            </w:pPr>
-            <w:r>
-              <w:t xml:space="preserve">比对、树、七项曲线与原曲线数据</w:t>
+              <w:t xml:space="preserve">功能预测</w:t>
+            </w:r>
+          </w:p>
+        </w:tc>
+        <w:tc>
+          <w:tcPr/>
+          <w:p>
+            <w:pPr>
+              <w:pStyle w:val="Compact"/>
+              <w:jc w:val="left"/>
+            </w:pPr>
+            <w:r>
+              <w:t xml:space="preserve">未抽平计数＋对应代表序列 QZA/FASTA；后续仍需 KO 映射等本模块参数</w:t>
             </w:r>
           </w:p>
         </w:tc>
@@ -3531,127 +3529,19 @@
               <w:jc w:val="left"/>
             </w:pPr>
             <w:r>
-              <w:rPr>
-                <w:rStyle w:val="VerbatimChar"/>
-              </w:rPr>
-              <w:t xml:space="preserve">07_diversity/diversity_*</w:t>
-            </w:r>
-          </w:p>
-        </w:tc>
-        <w:tc>
-          <w:tcPr/>
-          <w:p>
-            <w:pPr>
-              <w:pStyle w:val="Compact"/>
-              <w:jc w:val="left"/>
-            </w:pPr>
-            <w:r>
-              <w:t xml:space="preserve">本次保留名单、正式抽平表、指标、距离、统计及 R 图</w:t>
-            </w:r>
-          </w:p>
-        </w:tc>
-      </w:tr>
-      <w:tr>
-        <w:tc>
-          <w:tcPr/>
-          <w:p>
-            <w:pPr>
-              <w:pStyle w:val="Compact"/>
-              <w:jc w:val="left"/>
-            </w:pPr>
-            <w:r>
-              <w:rPr>
-                <w:rStyle w:val="VerbatimChar"/>
-              </w:rPr>
-              <w:t xml:space="preserve">10_abundance</w:t>
-            </w:r>
-            <w:r>
-              <w:t xml:space="preserve">、</w:t>
-            </w:r>
-            <w:r>
-              <w:rPr>
-                <w:rStyle w:val="VerbatimChar"/>
-              </w:rPr>
-              <w:t xml:space="preserve">11_extensions</w:t>
-            </w:r>
-          </w:p>
-        </w:tc>
-        <w:tc>
-          <w:tcPr/>
-          <w:p>
-            <w:pPr>
-              <w:pStyle w:val="Compact"/>
-              <w:jc w:val="left"/>
-            </w:pPr>
-            <w:r>
-              <w:t xml:space="preserve">完整丰度导出与各次扩展分析</w:t>
-            </w:r>
-          </w:p>
-        </w:tc>
-      </w:tr>
-      <w:tr>
-        <w:tc>
-          <w:tcPr/>
-          <w:p>
-            <w:pPr>
-              <w:pStyle w:val="Compact"/>
-              <w:jc w:val="left"/>
-            </w:pPr>
-            <w:r>
-              <w:rPr>
-                <w:rStyle w:val="VerbatimChar"/>
-              </w:rPr>
-              <w:t xml:space="preserve">09_execution_code</w:t>
-            </w:r>
-          </w:p>
-        </w:tc>
-        <w:tc>
-          <w:tcPr/>
-          <w:p>
-            <w:pPr>
-              <w:pStyle w:val="Compact"/>
-              <w:jc w:val="left"/>
-            </w:pPr>
-            <w:r>
-              <w:t xml:space="preserve">实际运行代码、参数及命令说明文档</w:t>
-            </w:r>
-          </w:p>
-        </w:tc>
-      </w:tr>
-      <w:tr>
-        <w:tc>
-          <w:tcPr/>
-          <w:p>
-            <w:pPr>
-              <w:pStyle w:val="Compact"/>
-              <w:jc w:val="left"/>
-            </w:pPr>
-            <w:r>
-              <w:rPr>
-                <w:rStyle w:val="VerbatimChar"/>
-              </w:rPr>
-              <w:t xml:space="preserve">说明.md</w:t>
-            </w:r>
-            <w:r>
-              <w:t xml:space="preserve">、</w:t>
-            </w:r>
-            <w:r>
-              <w:rPr>
-                <w:rStyle w:val="VerbatimChar"/>
-              </w:rPr>
-              <w:t xml:space="preserve">report.json</w:t>
-            </w:r>
-          </w:p>
-        </w:tc>
-        <w:tc>
-          <w:tcPr/>
-          <w:p>
-            <w:pPr>
-              <w:pStyle w:val="Compact"/>
-              <w:jc w:val="left"/>
-            </w:pPr>
-            <w:r>
-              <w:t xml:space="preserve">阶段输入、参数、计数、文件与完成/失败/跳过状态</w:t>
+              <w:t xml:space="preserve">高级分析</w:t>
+            </w:r>
+          </w:p>
+        </w:tc>
+        <w:tc>
+          <w:tcPr/>
+          <w:p>
+            <w:pPr>
+              <w:pStyle w:val="Compact"/>
+              <w:jc w:val="left"/>
+            </w:pPr>
+            <w:r>
+              <w:t xml:space="preserve">未抽平计数＋对应 Taxonomy QZA/TSV；表型关联另选附加表型 CSV</w:t>
             </w:r>
           </w:p>
         </w:tc>
@@ -3662,34 +3552,70 @@
         <w:pStyle w:val="BodyText"/>
       </w:pPr>
       <w:r>
-        <w:t xml:space="preserve">复核至少保留：原始数据及校验值、CSV、真实引物、分类器及数据库版本、完整 run、</w:t>
+        <w:t xml:space="preserve">文本计数表为特征×样本：第一列</w:t>
+      </w:r>
+      <w:r>
+        <w:t xml:space="preserve"> </w:t>
       </w:r>
       <w:r>
         <w:rPr>
           <w:rStyle w:val="VerbatimChar"/>
         </w:rPr>
-        <w:t xml:space="preserve">parameters.json</w:t>
-      </w:r>
-      <w:r>
-        <w:t xml:space="preserve">、</w:t>
+        <w:t xml:space="preserve">FeatureID</w:t>
+      </w:r>
+      <w:r>
+        <w:t xml:space="preserve">（也兼容标准 BIOM TSV 表头），后续每列一个 SampleID；例如</w:t>
+      </w:r>
+      <w:r>
+        <w:t xml:space="preserve"> </w:t>
       </w:r>
       <w:r>
         <w:rPr>
           <w:rStyle w:val="VerbatimChar"/>
         </w:rPr>
-        <w:t xml:space="preserve">commands.jsonl</w:t>
-      </w:r>
-      <w:r>
-        <w:t xml:space="preserve">、</w:t>
+        <w:t xml:space="preserve">FeatureID,001,002</w:t>
+      </w:r>
+      <w:r>
+        <w:t xml:space="preserve"> </w:t>
+      </w:r>
+      <w:r>
+        <w:t xml:space="preserve">后接</w:t>
+      </w:r>
+      <w:r>
+        <w:t xml:space="preserve"> </w:t>
       </w:r>
       <w:r>
         <w:rPr>
           <w:rStyle w:val="VerbatimChar"/>
         </w:rPr>
-        <w:t xml:space="preserve">workflow.log</w:t>
-      </w:r>
-      <w:r>
-        <w:t xml:space="preserve">、软件版本、推荐依据与手动修改理由。QZA/QZV provenance 记录工具来源，但不替代实验设计和实验室记录。</w:t>
+        <w:t xml:space="preserve">ASV1,12,34</w:t>
+      </w:r>
+      <w:r>
+        <w:t xml:space="preserve">。仅接受非负整数，不接受相对丰度。样本与分组须精确匹配，</w:t>
+      </w:r>
+      <w:r>
+        <w:rPr>
+          <w:rStyle w:val="VerbatimChar"/>
+        </w:rPr>
+        <w:t xml:space="preserve">001</w:t>
+      </w:r>
+      <w:r>
+        <w:t xml:space="preserve"> </w:t>
+      </w:r>
+      <w:r>
+        <w:t xml:space="preserve">不等于</w:t>
+      </w:r>
+      <w:r>
+        <w:t xml:space="preserve"> </w:t>
+      </w:r>
+      <w:r>
+        <w:rPr>
+          <w:rStyle w:val="VerbatimChar"/>
+        </w:rPr>
+        <w:t xml:space="preserve">1</w:t>
+      </w:r>
+      <w:r>
+        <w:t xml:space="preserve">。Taxonomy 至少含 FeatureID/Taxon，可含 Confidence。计数特征必须被注释/序列/树覆盖；辅助文件多余特征会记录，分类和序列另生成对齐后的派生文件，不修改原文件。仅缺末尾分类层级时可用显式未知占位符，保存补齐报告，不推断分类。</w:t>
       </w:r>
     </w:p>
     <w:p>
@@ -3697,17 +3623,105 @@
         <w:pStyle w:val="BodyText"/>
       </w:pPr>
       <w:r>
-        <w:t xml:space="preserve">随机抽平和置换重跑可能不同；不能仅凭源码相同声称逐数值完全复现。论文应报告具体软件版本、实际参数、过滤项、正式深度及丢样、检验与校正范围，而不只写“用工作站默认参数”。保存图片输入表比只保存 PNG 更有助于复核。</w:t>
-      </w:r>
-    </w:p>
-    <w:bookmarkEnd w:id="37"/>
-    <w:bookmarkStart w:id="38" w:name="guide-17"/>
-    <w:p>
-      <w:pPr>
-        <w:pStyle w:val="Heading2"/>
-      </w:pPr>
-      <w:r>
-        <w:t xml:space="preserve">17. 常见问题与故障排查</w:t>
+        <w:t xml:space="preserve">必须确认计数表没有抽平或归一化；数值恰为整数不能证明来源。程序核查 QZA 类型及可识别的抽平/相对量来源，保存源文件副本、SHA256、样本匹配和多余特征报告。成功准备只表示当前所选模块的必需输入已核验，</w:t>
+      </w:r>
+      <w:r>
+        <w:rPr>
+          <w:rStyle w:val="VerbatimChar"/>
+        </w:rPr>
+        <w:t xml:space="preserve">external_inputs_complete.json</w:t>
+      </w:r>
+      <w:r>
+        <w:t xml:space="preserve"> </w:t>
+      </w:r>
+      <w:r>
+        <w:t xml:space="preserve">不代表运行过 DADA2/分类/建树。外部结果的实验与原流程质控仍由数据来源决定；导入不会自动补做此前的污染过滤。</w:t>
+      </w:r>
+    </w:p>
+    <w:p>
+      <w:pPr>
+        <w:pStyle w:val="BodyText"/>
+      </w:pPr>
+      <w:r>
+        <w:rPr>
+          <w:b/>
+          <w:bCs/>
+        </w:rPr>
+        <w:t xml:space="preserve">失败后修改并继续</w:t>
+      </w:r>
+      <w:r>
+        <w:t xml:space="preserve">：</w:t>
+      </w:r>
+    </w:p>
+    <w:p>
+      <w:pPr>
+        <w:pStyle w:val="Compact"/>
+        <w:numPr>
+          <w:ilvl w:val="0"/>
+          <w:numId w:val="1004"/>
+        </w:numPr>
+      </w:pPr>
+      <w:r>
+        <w:t xml:space="preserve">在左侧“任务进度”找到失败任务，点击“打开并继续失败任务”；记录未列出时选择该失败任务自身的 run 目录。服务重启后，磁盘</w:t>
+      </w:r>
+      <w:r>
+        <w:t xml:space="preserve"> </w:t>
+      </w:r>
+      <w:r>
+        <w:rPr>
+          <w:rStyle w:val="VerbatimChar"/>
+        </w:rPr>
+        <w:t xml:space="preserve">task_state.json</w:t>
+      </w:r>
+      <w:r>
+        <w:t xml:space="preserve"> </w:t>
+      </w:r>
+      <w:r>
+        <w:t xml:space="preserve">仍可用于恢复。</w:t>
+      </w:r>
+    </w:p>
+    <w:p>
+      <w:pPr>
+        <w:pStyle w:val="Compact"/>
+        <w:numPr>
+          <w:ilvl w:val="0"/>
+          <w:numId w:val="1004"/>
+        </w:numPr>
+      </w:pPr>
+      <w:r>
+        <w:t xml:space="preserve">阅读恢复边界与原错误，进入相应分析区修改参数或环境，再点击“应用当前参数并继续此任务”。不要只在空白新批次里输入旧路径便假定会自动续跑。</w:t>
+      </w:r>
+    </w:p>
+    <w:p>
+      <w:pPr>
+        <w:pStyle w:val="Compact"/>
+        <w:numPr>
+          <w:ilvl w:val="0"/>
+          <w:numId w:val="1004"/>
+        </w:numPr>
+      </w:pPr>
+      <w:r>
+        <w:t xml:space="preserve">已核验导入/去引物检查点的预处理失败，会复制检查点到新 run，从 DADA2 重新执行后续阶段。若只是丰度导出失败且前面阶段齐全，可仅补做丰度。下游模块失败只重跑该模块；已有完整多样性统计而 R 绘图失败时，深度/置换未改变可只重绘。</w:t>
+      </w:r>
+    </w:p>
+    <w:p>
+      <w:pPr>
+        <w:pStyle w:val="Compact"/>
+        <w:numPr>
+          <w:ilvl w:val="0"/>
+          <w:numId w:val="1004"/>
+        </w:numPr>
+      </w:pPr>
+      <w:r>
+        <w:t xml:space="preserve">原始数据、分组、引物、检查点文件或边界之前参数改变，会拒绝复用并要求新任务。旧版任务若没有可核验指纹，会明确提示从导入重跑；程序不保证任意命令级断点续算。外部输入准备失败可独立重新准备，不涉及 FASTQ。修改外部源文件选择请重新打开外部输入对话框。</w:t>
+      </w:r>
+    </w:p>
+    <w:p>
+      <w:pPr>
+        <w:pStyle w:val="FirstParagraph"/>
+      </w:pPr>
+      <w:r>
+        <w:t xml:space="preserve">失败目录保持原样，新尝试另存。随机抽平若重新执行可能产生不同结果；只改图的缓存重绘不重新抽平或拟合。不要因多次尝试得到更小 P 值而择优报告。</w:t>
       </w:r>
     </w:p>
     <w:tbl>
@@ -3734,19 +3748,19 @@
               <w:jc w:val="left"/>
             </w:pPr>
             <w:r>
-              <w:t xml:space="preserve">现象</w:t>
-            </w:r>
-          </w:p>
-        </w:tc>
-        <w:tc>
-          <w:tcPr/>
-          <w:p>
-            <w:pPr>
-              <w:pStyle w:val="Compact"/>
-              <w:jc w:val="left"/>
-            </w:pPr>
-            <w:r>
-              <w:t xml:space="preserve">优先检查与处理</w:t>
+              <w:t xml:space="preserve">位置或文件</w:t>
+            </w:r>
+          </w:p>
+        </w:tc>
+        <w:tc>
+          <w:tcPr/>
+          <w:p>
+            <w:pPr>
+              <w:pStyle w:val="Compact"/>
+              <w:jc w:val="left"/>
+            </w:pPr>
+            <w:r>
+              <w:t xml:space="preserve">用途</w:t>
             </w:r>
           </w:p>
         </w:tc>
@@ -3759,38 +3773,64 @@
               <w:pStyle w:val="Compact"/>
               <w:jc w:val="left"/>
             </w:pPr>
-            <w:r>
-              <w:t xml:space="preserve">双击后网页打不开</w:t>
-            </w:r>
-          </w:p>
-        </w:tc>
-        <w:tc>
-          <w:tcPr/>
-          <w:p>
-            <w:pPr>
-              <w:pStyle w:val="Compact"/>
-              <w:jc w:val="left"/>
-            </w:pPr>
-            <w:r>
-              <w:t xml:space="preserve">用检查环境入口看 WSL/Conda；检查服务窗口及端口；方案 A 看</w:t>
-            </w:r>
-            <w:r>
-              <w:t xml:space="preserve"> </w:t>
-            </w:r>
             <w:r>
               <w:rPr>
                 <w:rStyle w:val="VerbatimChar"/>
               </w:rPr>
-              <w:t xml:space="preserve">日志/server.log</w:t>
-            </w:r>
-            <w:r>
-              <w:t xml:space="preserve">、</w:t>
-            </w:r>
+              <w:t xml:space="preserve">00_inputs</w:t>
+            </w:r>
+            <w:r>
+              <w:t xml:space="preserve">、manifest、metadata</w:t>
+            </w:r>
+          </w:p>
+        </w:tc>
+        <w:tc>
+          <w:tcPr/>
+          <w:p>
+            <w:pPr>
+              <w:pStyle w:val="Compact"/>
+              <w:jc w:val="left"/>
+            </w:pPr>
+            <w:r>
+              <w:t xml:space="preserve">实际文件映射、分组与输入来源</w:t>
+            </w:r>
+          </w:p>
+        </w:tc>
+      </w:tr>
+      <w:tr>
+        <w:tc>
+          <w:tcPr/>
+          <w:p>
+            <w:pPr>
+              <w:pStyle w:val="Compact"/>
+              <w:jc w:val="left"/>
+            </w:pPr>
             <w:r>
               <w:rPr>
                 <w:rStyle w:val="VerbatimChar"/>
               </w:rPr>
-              <w:t xml:space="preserve">wsl-launcher.log</w:t>
+              <w:t xml:space="preserve">01_import</w:t>
+            </w:r>
+            <w:r>
+              <w:t xml:space="preserve">、</w:t>
+            </w:r>
+            <w:r>
+              <w:rPr>
+                <w:rStyle w:val="VerbatimChar"/>
+              </w:rPr>
+              <w:t xml:space="preserve">02_primers</w:t>
+            </w:r>
+          </w:p>
+        </w:tc>
+        <w:tc>
+          <w:tcPr/>
+          <w:p>
+            <w:pPr>
+              <w:pStyle w:val="Compact"/>
+              <w:jc w:val="left"/>
+            </w:pPr>
+            <w:r>
+              <w:t xml:space="preserve">导入、质量图、清洗后 FASTQ 与残留检查</w:t>
             </w:r>
           </w:p>
         </w:tc>
@@ -3804,19 +3844,31 @@
               <w:jc w:val="left"/>
             </w:pPr>
             <w:r>
-              <w:t xml:space="preserve">更新后还是旧错误</w:t>
-            </w:r>
-          </w:p>
-        </w:tc>
-        <w:tc>
-          <w:tcPr/>
-          <w:p>
-            <w:pPr>
-              <w:pStyle w:val="Compact"/>
-              <w:jc w:val="left"/>
-            </w:pPr>
-            <w:r>
-              <w:t xml:space="preserve">核对网页服务版本、程序目录、启动时间；停止旧后台，重新启动正确入口</w:t>
+              <w:rPr>
+                <w:rStyle w:val="VerbatimChar"/>
+              </w:rPr>
+              <w:t xml:space="preserve">03_dada2</w:t>
+            </w:r>
+            <w:r>
+              <w:t xml:space="preserve">、</w:t>
+            </w:r>
+            <w:r>
+              <w:rPr>
+                <w:rStyle w:val="VerbatimChar"/>
+              </w:rPr>
+              <w:t xml:space="preserve">04_taxonomy_filter</w:t>
+            </w:r>
+          </w:p>
+        </w:tc>
+        <w:tc>
+          <w:tcPr/>
+          <w:p>
+            <w:pPr>
+              <w:pStyle w:val="Compact"/>
+              <w:jc w:val="left"/>
+            </w:pPr>
+            <w:r>
+              <w:t xml:space="preserve">完整 ASV 表、代表序列、降噪统计、分类和过滤表</w:t>
             </w:r>
           </w:p>
         </w:tc>
@@ -3830,19 +3882,31 @@
               <w:jc w:val="left"/>
             </w:pPr>
             <w:r>
-              <w:t xml:space="preserve">找不到 FASTQ 或配对错误</w:t>
-            </w:r>
-          </w:p>
-        </w:tc>
-        <w:tc>
-          <w:tcPr/>
-          <w:p>
-            <w:pPr>
-              <w:pStyle w:val="Compact"/>
-              <w:jc w:val="left"/>
-            </w:pPr>
-            <w:r>
-              <w:t xml:space="preserve">核对四列路径基准、文件扩展名、R1/R2 列；勿用改名掩盖真实多 lane 或重复文件</w:t>
+              <w:rPr>
+                <w:rStyle w:val="VerbatimChar"/>
+              </w:rPr>
+              <w:t xml:space="preserve">05_phylogeny</w:t>
+            </w:r>
+            <w:r>
+              <w:t xml:space="preserve">、</w:t>
+            </w:r>
+            <w:r>
+              <w:rPr>
+                <w:rStyle w:val="VerbatimChar"/>
+              </w:rPr>
+              <w:t xml:space="preserve">06_rarefaction</w:t>
+            </w:r>
+          </w:p>
+        </w:tc>
+        <w:tc>
+          <w:tcPr/>
+          <w:p>
+            <w:pPr>
+              <w:pStyle w:val="Compact"/>
+              <w:jc w:val="left"/>
+            </w:pPr>
+            <w:r>
+              <w:t xml:space="preserve">比对、树、七项曲线与原曲线数据</w:t>
             </w:r>
           </w:p>
         </w:tc>
@@ -3856,19 +3920,22 @@
               <w:jc w:val="left"/>
             </w:pPr>
             <w:r>
-              <w:t xml:space="preserve">引物未检出</w:t>
-            </w:r>
-          </w:p>
-        </w:tc>
-        <w:tc>
-          <w:tcPr/>
-          <w:p>
-            <w:pPr>
-              <w:pStyle w:val="Compact"/>
-              <w:jc w:val="left"/>
-            </w:pPr>
-            <w:r>
-              <w:t xml:space="preserve">核对真实序列、方向、处理说明；补充自定义候选，不自动判 clean</w:t>
+              <w:rPr>
+                <w:rStyle w:val="VerbatimChar"/>
+              </w:rPr>
+              <w:t xml:space="preserve">07_diversity/diversity_*</w:t>
+            </w:r>
+          </w:p>
+        </w:tc>
+        <w:tc>
+          <w:tcPr/>
+          <w:p>
+            <w:pPr>
+              <w:pStyle w:val="Compact"/>
+              <w:jc w:val="left"/>
+            </w:pPr>
+            <w:r>
+              <w:t xml:space="preserve">本次保留名单、正式抽平表、指标、距离、统计及 R 图</w:t>
             </w:r>
           </w:p>
         </w:tc>
@@ -3882,19 +3949,31 @@
               <w:jc w:val="left"/>
             </w:pPr>
             <w:r>
-              <w:t xml:space="preserve">filtered 很少</w:t>
-            </w:r>
-          </w:p>
-        </w:tc>
-        <w:tc>
-          <w:tcPr/>
-          <w:p>
-            <w:pPr>
-              <w:pStyle w:val="Compact"/>
-              <w:jc w:val="left"/>
-            </w:pPr>
-            <w:r>
-              <w:t xml:space="preserve">查处理后质量、长度、额外 trim 和逐样本统计，不先放宽全部阈值</w:t>
+              <w:rPr>
+                <w:rStyle w:val="VerbatimChar"/>
+              </w:rPr>
+              <w:t xml:space="preserve">10_abundance</w:t>
+            </w:r>
+            <w:r>
+              <w:t xml:space="preserve">、</w:t>
+            </w:r>
+            <w:r>
+              <w:rPr>
+                <w:rStyle w:val="VerbatimChar"/>
+              </w:rPr>
+              <w:t xml:space="preserve">11_extensions</w:t>
+            </w:r>
+          </w:p>
+        </w:tc>
+        <w:tc>
+          <w:tcPr/>
+          <w:p>
+            <w:pPr>
+              <w:pStyle w:val="Compact"/>
+              <w:jc w:val="left"/>
+            </w:pPr>
+            <w:r>
+              <w:t xml:space="preserve">完整丰度导出与各次扩展分析</w:t>
             </w:r>
           </w:p>
         </w:tc>
@@ -3908,19 +3987,22 @@
               <w:jc w:val="left"/>
             </w:pPr>
             <w:r>
-              <w:t xml:space="preserve">merged 很少</w:t>
-            </w:r>
-          </w:p>
-        </w:tc>
-        <w:tc>
-          <w:tcPr/>
-          <w:p>
-            <w:pPr>
-              <w:pStyle w:val="Compact"/>
-              <w:jc w:val="left"/>
-            </w:pPr>
-            <w:r>
-              <w:t xml:space="preserve">查配对、方向、预计重叠、引物/附加结构，确认输入未提前拼接</w:t>
+              <w:rPr>
+                <w:rStyle w:val="VerbatimChar"/>
+              </w:rPr>
+              <w:t xml:space="preserve">09_execution_code</w:t>
+            </w:r>
+          </w:p>
+        </w:tc>
+        <w:tc>
+          <w:tcPr/>
+          <w:p>
+            <w:pPr>
+              <w:pStyle w:val="Compact"/>
+              <w:jc w:val="left"/>
+            </w:pPr>
+            <w:r>
+              <w:t xml:space="preserve">实际运行代码、参数及命令说明文档</w:t>
             </w:r>
           </w:p>
         </w:tc>
@@ -3934,19 +4016,40 @@
               <w:jc w:val="left"/>
             </w:pPr>
             <w:r>
-              <w:t xml:space="preserve">某组抽平后没样本</w:t>
-            </w:r>
-          </w:p>
-        </w:tc>
-        <w:tc>
-          <w:tcPr/>
-          <w:p>
-            <w:pPr>
-              <w:pStyle w:val="Compact"/>
-              <w:jc w:val="left"/>
-            </w:pPr>
-            <w:r>
-              <w:t xml:space="preserve">看过滤后计数与保留名单，检查低深度原因，重新选择有依据的方案</w:t>
+              <w:rPr>
+                <w:rStyle w:val="VerbatimChar"/>
+              </w:rPr>
+              <w:t xml:space="preserve">task_state.json</w:t>
+            </w:r>
+            <w:r>
+              <w:t xml:space="preserve">、</w:t>
+            </w:r>
+            <w:r>
+              <w:rPr>
+                <w:rStyle w:val="VerbatimChar"/>
+              </w:rPr>
+              <w:t xml:space="preserve">quality_checkpoint.json</w:t>
+            </w:r>
+            <w:r>
+              <w:t xml:space="preserve">、</w:t>
+            </w:r>
+            <w:r>
+              <w:rPr>
+                <w:rStyle w:val="VerbatimChar"/>
+              </w:rPr>
+              <w:t xml:space="preserve">abundance_checkpoint.json</w:t>
+            </w:r>
+          </w:p>
+        </w:tc>
+        <w:tc>
+          <w:tcPr/>
+          <w:p>
+            <w:pPr>
+              <w:pStyle w:val="Compact"/>
+              <w:jc w:val="left"/>
+            </w:pPr>
+            <w:r>
+              <w:t xml:space="preserve">可恢复任务记录、完成阶段及源文件/参数指纹；不等于所有中间输出都可跳过</w:t>
             </w:r>
           </w:p>
         </w:tc>
@@ -3960,19 +4063,34 @@
               <w:jc w:val="left"/>
             </w:pPr>
             <w:r>
-              <w:t xml:space="preserve">分类失败</w:t>
-            </w:r>
-          </w:p>
-        </w:tc>
-        <w:tc>
-          <w:tcPr/>
-          <w:p>
-            <w:pPr>
-              <w:pStyle w:val="Compact"/>
-              <w:jc w:val="left"/>
-            </w:pPr>
-            <w:r>
-              <w:t xml:space="preserve">核对分类器类型、训练区域、方向及 QIIME/sklearn 兼容性；保存完整错误</w:t>
+              <w:rPr>
+                <w:rStyle w:val="VerbatimChar"/>
+              </w:rPr>
+              <w:t xml:space="preserve">external_inputs_complete.json</w:t>
+            </w:r>
+            <w:r>
+              <w:t xml:space="preserve">、外部任务</w:t>
+            </w:r>
+            <w:r>
+              <w:t xml:space="preserve"> </w:t>
+            </w:r>
+            <w:r>
+              <w:rPr>
+                <w:rStyle w:val="VerbatimChar"/>
+              </w:rPr>
+              <w:t xml:space="preserve">00_inputs</w:t>
+            </w:r>
+          </w:p>
+        </w:tc>
+        <w:tc>
+          <w:tcPr/>
+          <w:p>
+            <w:pPr>
+              <w:pStyle w:val="Compact"/>
+              <w:jc w:val="left"/>
+            </w:pPr>
+            <w:r>
+              <w:t xml:space="preserve">本模块外部来源、原件副本/校验值、样本和特征对齐、支持的模块</w:t>
             </w:r>
           </w:p>
         </w:tc>
@@ -3986,97 +4104,31 @@
               <w:jc w:val="left"/>
             </w:pPr>
             <w:r>
-              <w:t xml:space="preserve">R 绘图失败但 QIIME 已完成</w:t>
-            </w:r>
-          </w:p>
-        </w:tc>
-        <w:tc>
-          <w:tcPr/>
-          <w:p>
-            <w:pPr>
-              <w:pStyle w:val="Compact"/>
-              <w:jc w:val="left"/>
-            </w:pPr>
-            <w:r>
-              <w:t xml:space="preserve">使用专用 R 环境，查依赖和字体；保留已完成结果，修复后仅重绘</w:t>
-            </w:r>
-          </w:p>
-        </w:tc>
-      </w:tr>
-      <w:tr>
-        <w:tc>
-          <w:tcPr/>
-          <w:p>
-            <w:pPr>
-              <w:pStyle w:val="Compact"/>
-              <w:jc w:val="left"/>
-            </w:pPr>
-            <w:r>
-              <w:t xml:space="preserve">ANCOM-BC2 失败或 NA 多</w:t>
-            </w:r>
-          </w:p>
-        </w:tc>
-        <w:tc>
-          <w:tcPr/>
-          <w:p>
-            <w:pPr>
-              <w:pStyle w:val="Compact"/>
-              <w:jc w:val="left"/>
-            </w:pPr>
-            <w:r>
-              <w:t xml:space="preserve">查该层级 diagnostics、低检出、样本数、结构零和模型警告；NA 不填 0</w:t>
-            </w:r>
-          </w:p>
-        </w:tc>
-      </w:tr>
-      <w:tr>
-        <w:tc>
-          <w:tcPr/>
-          <w:p>
-            <w:pPr>
-              <w:pStyle w:val="Compact"/>
-              <w:jc w:val="left"/>
-            </w:pPr>
-            <w:r>
-              <w:t xml:space="preserve">LEfSe 没显著菌</w:t>
-            </w:r>
-          </w:p>
-        </w:tc>
-        <w:tc>
-          <w:tcPr/>
-          <w:p>
-            <w:pPr>
-              <w:pStyle w:val="Compact"/>
-              <w:jc w:val="left"/>
-            </w:pPr>
-            <w:r>
-              <w:t xml:space="preserve">查分组、样本量、筛选策略和缓存得分；无命中是合法结果，不改阈值追求命中</w:t>
-            </w:r>
-          </w:p>
-        </w:tc>
-      </w:tr>
-      <w:tr>
-        <w:tc>
-          <w:tcPr/>
-          <w:p>
-            <w:pPr>
-              <w:pStyle w:val="Compact"/>
-              <w:jc w:val="left"/>
-            </w:pPr>
-            <w:r>
-              <w:t xml:space="preserve">PICRUSt2 排除多</w:t>
-            </w:r>
-          </w:p>
-        </w:tc>
-        <w:tc>
-          <w:tcPr/>
-          <w:p>
-            <w:pPr>
-              <w:pStyle w:val="Compact"/>
-              <w:jc w:val="left"/>
-            </w:pPr>
-            <w:r>
-              <w:t xml:space="preserve">查比对、区域、NSTI 和参考覆盖；高保留不等于高准确，不自动放宽阈值</w:t>
+              <w:rPr>
+                <w:rStyle w:val="VerbatimChar"/>
+              </w:rPr>
+              <w:t xml:space="preserve">说明.md</w:t>
+            </w:r>
+            <w:r>
+              <w:t xml:space="preserve">、</w:t>
+            </w:r>
+            <w:r>
+              <w:rPr>
+                <w:rStyle w:val="VerbatimChar"/>
+              </w:rPr>
+              <w:t xml:space="preserve">report.json</w:t>
+            </w:r>
+          </w:p>
+        </w:tc>
+        <w:tc>
+          <w:tcPr/>
+          <w:p>
+            <w:pPr>
+              <w:pStyle w:val="Compact"/>
+              <w:jc w:val="left"/>
+            </w:pPr>
+            <w:r>
+              <w:t xml:space="preserve">阶段输入、参数、计数、文件与完成/失败/跳过状态</w:t>
             </w:r>
           </w:p>
         </w:tc>
@@ -4087,17 +4139,34 @@
         <w:pStyle w:val="BodyText"/>
       </w:pPr>
       <w:r>
-        <w:rPr>
-          <w:b/>
-          <w:bCs/>
-        </w:rPr>
-        <w:t xml:space="preserve">为什么同样数据换深度 P 值不同？</w:t>
-      </w:r>
-      <w:r>
-        <w:t xml:space="preserve"> </w:t>
-      </w:r>
-      <w:r>
-        <w:t xml:space="preserve">抽样改变输入，同时可能改变留样；置换也有随机性。预先定义主分析，保存其他选择作为敏感性分析。</w:t>
+        <w:t xml:space="preserve">复核至少保留：原始数据及校验值、CSV、真实引物、分类器及数据库版本、完整 run、</w:t>
+      </w:r>
+      <w:r>
+        <w:rPr>
+          <w:rStyle w:val="VerbatimChar"/>
+        </w:rPr>
+        <w:t xml:space="preserve">parameters.json</w:t>
+      </w:r>
+      <w:r>
+        <w:t xml:space="preserve">、</w:t>
+      </w:r>
+      <w:r>
+        <w:rPr>
+          <w:rStyle w:val="VerbatimChar"/>
+        </w:rPr>
+        <w:t xml:space="preserve">commands.jsonl</w:t>
+      </w:r>
+      <w:r>
+        <w:t xml:space="preserve">、</w:t>
+      </w:r>
+      <w:r>
+        <w:rPr>
+          <w:rStyle w:val="VerbatimChar"/>
+        </w:rPr>
+        <w:t xml:space="preserve">workflow.log</w:t>
+      </w:r>
+      <w:r>
+        <w:t xml:space="preserve">、软件版本、推荐依据与手动修改理由。QZA/QZV provenance 记录工具来源，但不替代实验设计和实验室记录。</w:t>
       </w:r>
     </w:p>
     <w:p>
@@ -4105,107 +4174,17 @@
         <w:pStyle w:val="BodyText"/>
       </w:pPr>
       <w:r>
-        <w:rPr>
-          <w:b/>
-          <w:bCs/>
-        </w:rPr>
-        <w:t xml:space="preserve">为什么 α 不显著但 β 显著？</w:t>
-      </w:r>
-      <w:r>
-        <w:t xml:space="preserve"> </w:t>
-      </w:r>
-      <w:r>
-        <w:t xml:space="preserve">两组可有相近丰富度和均匀度，却由不同成员组成；它们回答不同问题。</w:t>
-      </w:r>
-    </w:p>
-    <w:p>
-      <w:pPr>
-        <w:pStyle w:val="BodyText"/>
-      </w:pPr>
-      <w:r>
-        <w:rPr>
-          <w:b/>
-          <w:bCs/>
-        </w:rPr>
-        <w:t xml:space="preserve">为什么 Shannon 更高不等于更健康？</w:t>
-      </w:r>
-      <w:r>
-        <w:t xml:space="preserve"> </w:t>
-      </w:r>
-      <w:r>
-        <w:t xml:space="preserve">健康含义依赖宿主、部位、疾病与功能；某些正常生态位本就由少数成员占优势。</w:t>
-      </w:r>
-    </w:p>
-    <w:p>
-      <w:pPr>
-        <w:pStyle w:val="BodyText"/>
-      </w:pPr>
-      <w:r>
-        <w:rPr>
-          <w:b/>
-          <w:bCs/>
-        </w:rPr>
-        <w:t xml:space="preserve">可以删掉离群点让图更整齐吗？</w:t>
-      </w:r>
-      <w:r>
-        <w:t xml:space="preserve"> </w:t>
-      </w:r>
-      <w:r>
-        <w:t xml:space="preserve">先核对实验记录、污染和质量。排除须有独立理由并保留记录，不能仅因改变显著性而删样。</w:t>
-      </w:r>
-    </w:p>
-    <w:p>
-      <w:pPr>
-        <w:pStyle w:val="BodyText"/>
-      </w:pPr>
-      <w:r>
-        <w:rPr>
-          <w:b/>
-          <w:bCs/>
-        </w:rPr>
-        <w:t xml:space="preserve">为什么换分类器后菌名变了？</w:t>
-      </w:r>
-      <w:r>
-        <w:t xml:space="preserve"> </w:t>
-      </w:r>
-      <w:r>
-        <w:t xml:space="preserve">参考库、分类体系、训练区域和版本会改变标签；可用同一代表序列追踪，但不能把不同名称体系直接混合。</w:t>
-      </w:r>
-    </w:p>
-    <w:p>
-      <w:pPr>
-        <w:pStyle w:val="BodyText"/>
-      </w:pPr>
-      <w:r>
-        <w:rPr>
-          <w:b/>
-          <w:bCs/>
-        </w:rPr>
-        <w:t xml:space="preserve">需要重新安装所有环境吗？</w:t>
-      </w:r>
-      <w:r>
-        <w:t xml:space="preserve"> </w:t>
-      </w:r>
-      <w:r>
-        <w:t xml:space="preserve">先运行环境检查；仅补缺失依赖。绘图 R 与 QIIME 隔离，避免为修图破坏可用的 QIIME 环境。</w:t>
-      </w:r>
-    </w:p>
-    <w:p>
-      <w:pPr>
-        <w:pStyle w:val="BodyText"/>
-      </w:pPr>
-      <w:r>
-        <w:t xml:space="preserve">排错时先找到最早失败的具体命令和错误，保留日志、当前版本与任务目录，再处理相应步骤。不要删除原始数据、关闭 TLS 校验或伪造成功标记来绕过问题。</w:t>
-      </w:r>
-    </w:p>
-    <w:bookmarkEnd w:id="38"/>
-    <w:bookmarkStart w:id="39" w:name="guide-18"/>
+        <w:t xml:space="preserve">随机抽平和置换重跑可能不同；不能仅凭源码相同声称逐数值完全复现。论文应报告具体软件版本、实际参数、过滤项、正式深度及丢样、检验与校正范围，而不只写“用工作站默认参数”。保存图片输入表比只保存 PNG 更有助于复核。</w:t>
+      </w:r>
+    </w:p>
+    <w:bookmarkEnd w:id="37"/>
+    <w:bookmarkStart w:id="38" w:name="guide-17"/>
     <w:p>
       <w:pPr>
         <w:pStyle w:val="Heading2"/>
       </w:pPr>
       <w:r>
-        <w:t xml:space="preserve">18. 常用术语速查</w:t>
+        <w:t xml:space="preserve">17. 常见问题与故障排查</w:t>
       </w:r>
     </w:p>
     <w:tbl>
@@ -4232,6 +4211,504 @@
               <w:jc w:val="left"/>
             </w:pPr>
             <w:r>
+              <w:t xml:space="preserve">现象</w:t>
+            </w:r>
+          </w:p>
+        </w:tc>
+        <w:tc>
+          <w:tcPr/>
+          <w:p>
+            <w:pPr>
+              <w:pStyle w:val="Compact"/>
+              <w:jc w:val="left"/>
+            </w:pPr>
+            <w:r>
+              <w:t xml:space="preserve">优先检查与处理</w:t>
+            </w:r>
+          </w:p>
+        </w:tc>
+      </w:tr>
+      <w:tr>
+        <w:tc>
+          <w:tcPr/>
+          <w:p>
+            <w:pPr>
+              <w:pStyle w:val="Compact"/>
+              <w:jc w:val="left"/>
+            </w:pPr>
+            <w:r>
+              <w:t xml:space="preserve">双击后网页打不开</w:t>
+            </w:r>
+          </w:p>
+        </w:tc>
+        <w:tc>
+          <w:tcPr/>
+          <w:p>
+            <w:pPr>
+              <w:pStyle w:val="Compact"/>
+              <w:jc w:val="left"/>
+            </w:pPr>
+            <w:r>
+              <w:t xml:space="preserve">用检查环境入口看 WSL/Conda；检查服务窗口及端口；方案 A 看</w:t>
+            </w:r>
+            <w:r>
+              <w:t xml:space="preserve"> </w:t>
+            </w:r>
+            <w:r>
+              <w:rPr>
+                <w:rStyle w:val="VerbatimChar"/>
+              </w:rPr>
+              <w:t xml:space="preserve">日志/server.log</w:t>
+            </w:r>
+            <w:r>
+              <w:t xml:space="preserve">、</w:t>
+            </w:r>
+            <w:r>
+              <w:rPr>
+                <w:rStyle w:val="VerbatimChar"/>
+              </w:rPr>
+              <w:t xml:space="preserve">wsl-launcher.log</w:t>
+            </w:r>
+          </w:p>
+        </w:tc>
+      </w:tr>
+      <w:tr>
+        <w:tc>
+          <w:tcPr/>
+          <w:p>
+            <w:pPr>
+              <w:pStyle w:val="Compact"/>
+              <w:jc w:val="left"/>
+            </w:pPr>
+            <w:r>
+              <w:t xml:space="preserve">更新后还是旧错误</w:t>
+            </w:r>
+          </w:p>
+        </w:tc>
+        <w:tc>
+          <w:tcPr/>
+          <w:p>
+            <w:pPr>
+              <w:pStyle w:val="Compact"/>
+              <w:jc w:val="left"/>
+            </w:pPr>
+            <w:r>
+              <w:t xml:space="preserve">核对网页服务版本、程序目录、启动时间；停止旧后台，重新启动正确入口</w:t>
+            </w:r>
+          </w:p>
+        </w:tc>
+      </w:tr>
+      <w:tr>
+        <w:tc>
+          <w:tcPr/>
+          <w:p>
+            <w:pPr>
+              <w:pStyle w:val="Compact"/>
+              <w:jc w:val="left"/>
+            </w:pPr>
+            <w:r>
+              <w:t xml:space="preserve">找不到 FASTQ 或配对错误</w:t>
+            </w:r>
+          </w:p>
+        </w:tc>
+        <w:tc>
+          <w:tcPr/>
+          <w:p>
+            <w:pPr>
+              <w:pStyle w:val="Compact"/>
+              <w:jc w:val="left"/>
+            </w:pPr>
+            <w:r>
+              <w:t xml:space="preserve">核对四列路径基准、文件扩展名、R1/R2 列；勿用改名掩盖真实多 lane 或重复文件</w:t>
+            </w:r>
+          </w:p>
+        </w:tc>
+      </w:tr>
+      <w:tr>
+        <w:tc>
+          <w:tcPr/>
+          <w:p>
+            <w:pPr>
+              <w:pStyle w:val="Compact"/>
+              <w:jc w:val="left"/>
+            </w:pPr>
+            <w:r>
+              <w:t xml:space="preserve">引物未检出</w:t>
+            </w:r>
+          </w:p>
+        </w:tc>
+        <w:tc>
+          <w:tcPr/>
+          <w:p>
+            <w:pPr>
+              <w:pStyle w:val="Compact"/>
+              <w:jc w:val="left"/>
+            </w:pPr>
+            <w:r>
+              <w:t xml:space="preserve">核对真实序列、方向、处理说明；补充自定义候选，不自动判 clean</w:t>
+            </w:r>
+          </w:p>
+        </w:tc>
+      </w:tr>
+      <w:tr>
+        <w:tc>
+          <w:tcPr/>
+          <w:p>
+            <w:pPr>
+              <w:pStyle w:val="Compact"/>
+              <w:jc w:val="left"/>
+            </w:pPr>
+            <w:r>
+              <w:t xml:space="preserve">filtered 很少</w:t>
+            </w:r>
+          </w:p>
+        </w:tc>
+        <w:tc>
+          <w:tcPr/>
+          <w:p>
+            <w:pPr>
+              <w:pStyle w:val="Compact"/>
+              <w:jc w:val="left"/>
+            </w:pPr>
+            <w:r>
+              <w:t xml:space="preserve">查处理后质量、长度、额外 trim 和逐样本统计，不先放宽全部阈值</w:t>
+            </w:r>
+          </w:p>
+        </w:tc>
+      </w:tr>
+      <w:tr>
+        <w:tc>
+          <w:tcPr/>
+          <w:p>
+            <w:pPr>
+              <w:pStyle w:val="Compact"/>
+              <w:jc w:val="left"/>
+            </w:pPr>
+            <w:r>
+              <w:t xml:space="preserve">merged 很少</w:t>
+            </w:r>
+          </w:p>
+        </w:tc>
+        <w:tc>
+          <w:tcPr/>
+          <w:p>
+            <w:pPr>
+              <w:pStyle w:val="Compact"/>
+              <w:jc w:val="left"/>
+            </w:pPr>
+            <w:r>
+              <w:t xml:space="preserve">查配对、方向、预计重叠、引物/附加结构，确认输入未提前拼接</w:t>
+            </w:r>
+          </w:p>
+        </w:tc>
+      </w:tr>
+      <w:tr>
+        <w:tc>
+          <w:tcPr/>
+          <w:p>
+            <w:pPr>
+              <w:pStyle w:val="Compact"/>
+              <w:jc w:val="left"/>
+            </w:pPr>
+            <w:r>
+              <w:t xml:space="preserve">某组抽平后没样本</w:t>
+            </w:r>
+          </w:p>
+        </w:tc>
+        <w:tc>
+          <w:tcPr/>
+          <w:p>
+            <w:pPr>
+              <w:pStyle w:val="Compact"/>
+              <w:jc w:val="left"/>
+            </w:pPr>
+            <w:r>
+              <w:t xml:space="preserve">看过滤后计数与保留名单，检查低深度原因，重新选择有依据的方案</w:t>
+            </w:r>
+          </w:p>
+        </w:tc>
+      </w:tr>
+      <w:tr>
+        <w:tc>
+          <w:tcPr/>
+          <w:p>
+            <w:pPr>
+              <w:pStyle w:val="Compact"/>
+              <w:jc w:val="left"/>
+            </w:pPr>
+            <w:r>
+              <w:t xml:space="preserve">分类失败</w:t>
+            </w:r>
+          </w:p>
+        </w:tc>
+        <w:tc>
+          <w:tcPr/>
+          <w:p>
+            <w:pPr>
+              <w:pStyle w:val="Compact"/>
+              <w:jc w:val="left"/>
+            </w:pPr>
+            <w:r>
+              <w:t xml:space="preserve">核对分类器类型、训练区域、方向及 QIIME/sklearn 兼容性；保存完整错误</w:t>
+            </w:r>
+          </w:p>
+        </w:tc>
+      </w:tr>
+      <w:tr>
+        <w:tc>
+          <w:tcPr/>
+          <w:p>
+            <w:pPr>
+              <w:pStyle w:val="Compact"/>
+              <w:jc w:val="left"/>
+            </w:pPr>
+            <w:r>
+              <w:t xml:space="preserve">R 绘图失败但 QIIME 已完成</w:t>
+            </w:r>
+          </w:p>
+        </w:tc>
+        <w:tc>
+          <w:tcPr/>
+          <w:p>
+            <w:pPr>
+              <w:pStyle w:val="Compact"/>
+              <w:jc w:val="left"/>
+            </w:pPr>
+            <w:r>
+              <w:t xml:space="preserve">使用专用 R 环境，查依赖和字体；保留已完成结果，修复后仅重绘</w:t>
+            </w:r>
+          </w:p>
+        </w:tc>
+      </w:tr>
+      <w:tr>
+        <w:tc>
+          <w:tcPr/>
+          <w:p>
+            <w:pPr>
+              <w:pStyle w:val="Compact"/>
+              <w:jc w:val="left"/>
+            </w:pPr>
+            <w:r>
+              <w:t xml:space="preserve">ANCOM-BC2 失败或 NA 多</w:t>
+            </w:r>
+          </w:p>
+        </w:tc>
+        <w:tc>
+          <w:tcPr/>
+          <w:p>
+            <w:pPr>
+              <w:pStyle w:val="Compact"/>
+              <w:jc w:val="left"/>
+            </w:pPr>
+            <w:r>
+              <w:t xml:space="preserve">查该层级 diagnostics、低检出、样本数、结构零和模型警告；NA 不填 0</w:t>
+            </w:r>
+          </w:p>
+        </w:tc>
+      </w:tr>
+      <w:tr>
+        <w:tc>
+          <w:tcPr/>
+          <w:p>
+            <w:pPr>
+              <w:pStyle w:val="Compact"/>
+              <w:jc w:val="left"/>
+            </w:pPr>
+            <w:r>
+              <w:t xml:space="preserve">LEfSe 没显著菌</w:t>
+            </w:r>
+          </w:p>
+        </w:tc>
+        <w:tc>
+          <w:tcPr/>
+          <w:p>
+            <w:pPr>
+              <w:pStyle w:val="Compact"/>
+              <w:jc w:val="left"/>
+            </w:pPr>
+            <w:r>
+              <w:t xml:space="preserve">查分组、样本量、筛选策略和缓存得分；无命中是合法结果，不改阈值追求命中</w:t>
+            </w:r>
+          </w:p>
+        </w:tc>
+      </w:tr>
+      <w:tr>
+        <w:tc>
+          <w:tcPr/>
+          <w:p>
+            <w:pPr>
+              <w:pStyle w:val="Compact"/>
+              <w:jc w:val="left"/>
+            </w:pPr>
+            <w:r>
+              <w:t xml:space="preserve">PICRUSt2 排除多</w:t>
+            </w:r>
+          </w:p>
+        </w:tc>
+        <w:tc>
+          <w:tcPr/>
+          <w:p>
+            <w:pPr>
+              <w:pStyle w:val="Compact"/>
+              <w:jc w:val="left"/>
+            </w:pPr>
+            <w:r>
+              <w:t xml:space="preserve">查比对、区域、NSTI 和参考覆盖；高保留不等于高准确，不自动放宽阈值</w:t>
+            </w:r>
+          </w:p>
+        </w:tc>
+      </w:tr>
+    </w:tbl>
+    <w:p>
+      <w:pPr>
+        <w:pStyle w:val="BodyText"/>
+      </w:pPr>
+      <w:r>
+        <w:rPr>
+          <w:b/>
+          <w:bCs/>
+        </w:rPr>
+        <w:t xml:space="preserve">为什么同样数据换深度 P 值不同？</w:t>
+      </w:r>
+      <w:r>
+        <w:t xml:space="preserve"> </w:t>
+      </w:r>
+      <w:r>
+        <w:t xml:space="preserve">抽样改变输入，同时可能改变留样；置换也有随机性。预先定义主分析，保存其他选择作为敏感性分析。</w:t>
+      </w:r>
+    </w:p>
+    <w:p>
+      <w:pPr>
+        <w:pStyle w:val="BodyText"/>
+      </w:pPr>
+      <w:r>
+        <w:rPr>
+          <w:b/>
+          <w:bCs/>
+        </w:rPr>
+        <w:t xml:space="preserve">为什么 α 不显著但 β 显著？</w:t>
+      </w:r>
+      <w:r>
+        <w:t xml:space="preserve"> </w:t>
+      </w:r>
+      <w:r>
+        <w:t xml:space="preserve">两组可有相近丰富度和均匀度，却由不同成员组成；它们回答不同问题。</w:t>
+      </w:r>
+    </w:p>
+    <w:p>
+      <w:pPr>
+        <w:pStyle w:val="BodyText"/>
+      </w:pPr>
+      <w:r>
+        <w:rPr>
+          <w:b/>
+          <w:bCs/>
+        </w:rPr>
+        <w:t xml:space="preserve">为什么 Shannon 更高不等于更健康？</w:t>
+      </w:r>
+      <w:r>
+        <w:t xml:space="preserve"> </w:t>
+      </w:r>
+      <w:r>
+        <w:t xml:space="preserve">健康含义依赖宿主、部位、疾病与功能；某些正常生态位本就由少数成员占优势。</w:t>
+      </w:r>
+    </w:p>
+    <w:p>
+      <w:pPr>
+        <w:pStyle w:val="BodyText"/>
+      </w:pPr>
+      <w:r>
+        <w:rPr>
+          <w:b/>
+          <w:bCs/>
+        </w:rPr>
+        <w:t xml:space="preserve">可以删掉离群点让图更整齐吗？</w:t>
+      </w:r>
+      <w:r>
+        <w:t xml:space="preserve"> </w:t>
+      </w:r>
+      <w:r>
+        <w:t xml:space="preserve">先核对实验记录、污染和质量。排除须有独立理由并保留记录，不能仅因改变显著性而删样。</w:t>
+      </w:r>
+    </w:p>
+    <w:p>
+      <w:pPr>
+        <w:pStyle w:val="BodyText"/>
+      </w:pPr>
+      <w:r>
+        <w:rPr>
+          <w:b/>
+          <w:bCs/>
+        </w:rPr>
+        <w:t xml:space="preserve">为什么换分类器后菌名变了？</w:t>
+      </w:r>
+      <w:r>
+        <w:t xml:space="preserve"> </w:t>
+      </w:r>
+      <w:r>
+        <w:t xml:space="preserve">参考库、分类体系、训练区域和版本会改变标签；可用同一代表序列追踪，但不能把不同名称体系直接混合。</w:t>
+      </w:r>
+    </w:p>
+    <w:p>
+      <w:pPr>
+        <w:pStyle w:val="BodyText"/>
+      </w:pPr>
+      <w:r>
+        <w:rPr>
+          <w:b/>
+          <w:bCs/>
+        </w:rPr>
+        <w:t xml:space="preserve">需要重新安装所有环境吗？</w:t>
+      </w:r>
+      <w:r>
+        <w:t xml:space="preserve"> </w:t>
+      </w:r>
+      <w:r>
+        <w:t xml:space="preserve">先运行环境检查；仅补缺失依赖。绘图 R 与 QIIME 隔离，避免为修图破坏可用的 QIIME 环境。</w:t>
+      </w:r>
+    </w:p>
+    <w:p>
+      <w:pPr>
+        <w:pStyle w:val="BodyText"/>
+      </w:pPr>
+      <w:r>
+        <w:t xml:space="preserve">排错时先找到最早失败的具体命令和错误，保留日志、当前版本与任务目录，再处理相应步骤。不要删除原始数据、关闭 TLS 校验或伪造成功标记来绕过问题。</w:t>
+      </w:r>
+    </w:p>
+    <w:bookmarkEnd w:id="38"/>
+    <w:bookmarkStart w:id="39" w:name="guide-18"/>
+    <w:p>
+      <w:pPr>
+        <w:pStyle w:val="Heading2"/>
+      </w:pPr>
+      <w:r>
+        <w:t xml:space="preserve">18. 常用术语速查</w:t>
+      </w:r>
+    </w:p>
+    <w:tbl>
+      <w:tblPr>
+        <w:tblStyle w:val="Table"/>
+        <w:tblW w:type="pct" w:w="5000"/>
+        <w:jc w:val="left"/>
+        <w:tblLayout w:type="fixed"/>
+        <w:tblLook w:firstRow="1" w:lastRow="0" w:firstColumn="0" w:lastColumn="0" w:noHBand="0" w:noVBand="0" w:val="0020"/>
+      </w:tblPr>
+      <w:tblGrid>
+        <w:gridCol w:w="3960"/>
+        <w:gridCol w:w="3960"/>
+      </w:tblGrid>
+      <w:tr>
+        <w:trPr>
+          <w:tblHeader w:val="on"/>
+        </w:trPr>
+        <w:tc>
+          <w:tcPr/>
+          <w:p>
+            <w:pPr>
+              <w:pStyle w:val="Compact"/>
+              <w:jc w:val="left"/>
+            </w:pPr>
+            <w:r>
               <w:t xml:space="preserve">术语</w:t>
             </w:r>
           </w:p>
@@ -4689,7 +5166,7 @@
         <w:pStyle w:val="Compact"/>
         <w:numPr>
           <w:ilvl w:val="0"/>
-          <w:numId w:val="1004"/>
+          <w:numId w:val="1005"/>
         </w:numPr>
       </w:pPr>
       <w:r>
@@ -4754,7 +5231,7 @@
         <w:pStyle w:val="Compact"/>
         <w:numPr>
           <w:ilvl w:val="0"/>
-          <w:numId w:val="1004"/>
+          <w:numId w:val="1005"/>
         </w:numPr>
       </w:pPr>
       <w:r>
@@ -4808,7 +5285,7 @@
         <w:pStyle w:val="Compact"/>
         <w:numPr>
           <w:ilvl w:val="0"/>
-          <w:numId w:val="1004"/>
+          <w:numId w:val="1005"/>
         </w:numPr>
       </w:pPr>
       <w:r>
@@ -4854,7 +5331,7 @@
         <w:pStyle w:val="Compact"/>
         <w:numPr>
           <w:ilvl w:val="0"/>
-          <w:numId w:val="1004"/>
+          <w:numId w:val="1005"/>
         </w:numPr>
       </w:pPr>
       <w:r>
@@ -4912,7 +5389,7 @@
         <w:pStyle w:val="Compact"/>
         <w:numPr>
           <w:ilvl w:val="0"/>
-          <w:numId w:val="1004"/>
+          <w:numId w:val="1005"/>
         </w:numPr>
       </w:pPr>
       <w:r>
@@ -4969,7 +5446,7 @@
         <w:pStyle w:val="Compact"/>
         <w:numPr>
           <w:ilvl w:val="0"/>
-          <w:numId w:val="1004"/>
+          <w:numId w:val="1005"/>
         </w:numPr>
       </w:pPr>
       <w:r>
@@ -5017,7 +5494,7 @@
         <w:pStyle w:val="Compact"/>
         <w:numPr>
           <w:ilvl w:val="0"/>
-          <w:numId w:val="1004"/>
+          <w:numId w:val="1005"/>
         </w:numPr>
       </w:pPr>
       <w:r>
@@ -5072,7 +5549,7 @@
         <w:pStyle w:val="Compact"/>
         <w:numPr>
           <w:ilvl w:val="0"/>
-          <w:numId w:val="1004"/>
+          <w:numId w:val="1005"/>
         </w:numPr>
       </w:pPr>
       <w:r>
@@ -5118,7 +5595,7 @@
         <w:pStyle w:val="Compact"/>
         <w:numPr>
           <w:ilvl w:val="0"/>
-          <w:numId w:val="1004"/>
+          <w:numId w:val="1005"/>
         </w:numPr>
       </w:pPr>
       <w:r>
@@ -5164,7 +5641,7 @@
         <w:pStyle w:val="Compact"/>
         <w:numPr>
           <w:ilvl w:val="0"/>
-          <w:numId w:val="1004"/>
+          <w:numId w:val="1005"/>
         </w:numPr>
       </w:pPr>
       <w:r>
@@ -5197,7 +5674,7 @@
         <w:pStyle w:val="Compact"/>
         <w:numPr>
           <w:ilvl w:val="0"/>
-          <w:numId w:val="1004"/>
+          <w:numId w:val="1005"/>
         </w:numPr>
       </w:pPr>
       <w:r>
@@ -5254,7 +5731,7 @@
         <w:pStyle w:val="Compact"/>
         <w:numPr>
           <w:ilvl w:val="0"/>
-          <w:numId w:val="1004"/>
+          <w:numId w:val="1005"/>
         </w:numPr>
       </w:pPr>
       <w:r>
@@ -5300,7 +5777,7 @@
         <w:pStyle w:val="Compact"/>
         <w:numPr>
           <w:ilvl w:val="0"/>
-          <w:numId w:val="1004"/>
+          <w:numId w:val="1005"/>
         </w:numPr>
       </w:pPr>
       <w:r>
@@ -5343,7 +5820,7 @@
         <w:pStyle w:val="Compact"/>
         <w:numPr>
           <w:ilvl w:val="0"/>
-          <w:numId w:val="1004"/>
+          <w:numId w:val="1005"/>
         </w:numPr>
       </w:pPr>
       <w:r>
@@ -5400,7 +5877,7 @@
         <w:pStyle w:val="Compact"/>
         <w:numPr>
           <w:ilvl w:val="0"/>
-          <w:numId w:val="1004"/>
+          <w:numId w:val="1005"/>
         </w:numPr>
       </w:pPr>
       <w:r>
@@ -5454,7 +5931,7 @@
         <w:pStyle w:val="Compact"/>
         <w:numPr>
           <w:ilvl w:val="0"/>
-          <w:numId w:val="1004"/>
+          <w:numId w:val="1005"/>
         </w:numPr>
       </w:pPr>
       <w:r>
@@ -5508,7 +5985,7 @@
         <w:pStyle w:val="Compact"/>
         <w:numPr>
           <w:ilvl w:val="0"/>
-          <w:numId w:val="1004"/>
+          <w:numId w:val="1005"/>
         </w:numPr>
       </w:pPr>
       <w:r>
@@ -5551,7 +6028,7 @@
         <w:pStyle w:val="Compact"/>
         <w:numPr>
           <w:ilvl w:val="0"/>
-          <w:numId w:val="1004"/>
+          <w:numId w:val="1005"/>
         </w:numPr>
       </w:pPr>
       <w:r>
@@ -5620,7 +6097,7 @@
         <w:pStyle w:val="Compact"/>
         <w:numPr>
           <w:ilvl w:val="0"/>
-          <w:numId w:val="1004"/>
+          <w:numId w:val="1005"/>
         </w:numPr>
       </w:pPr>
       <w:r>
@@ -5666,7 +6143,7 @@
         <w:pStyle w:val="Compact"/>
         <w:numPr>
           <w:ilvl w:val="0"/>
-          <w:numId w:val="1004"/>
+          <w:numId w:val="1005"/>
         </w:numPr>
       </w:pPr>
       <w:r>
@@ -5734,7 +6211,7 @@
         <w:pStyle w:val="Compact"/>
         <w:numPr>
           <w:ilvl w:val="0"/>
-          <w:numId w:val="1004"/>
+          <w:numId w:val="1005"/>
         </w:numPr>
       </w:pPr>
       <w:r>
@@ -5788,7 +6265,7 @@
         <w:pStyle w:val="Compact"/>
         <w:numPr>
           <w:ilvl w:val="0"/>
-          <w:numId w:val="1004"/>
+          <w:numId w:val="1005"/>
         </w:numPr>
       </w:pPr>
       <w:r>
@@ -5834,7 +6311,7 @@
         <w:rPr>
           <w:rStyle w:val="VerbatimChar"/>
         </w:rPr>
-        <w:t xml:space="preserve">54f3d85b5ac138f3699bbe9d0b80742882dc73d6bc1f2f0385783517f4d6d46b</w:t>
+        <w:t xml:space="preserve">df87b65ea9928d08138efdc8c447da053df62e77dc392998173e85e0dfe80352</w:t>
       </w:r>
       <w:r>
         <w:t xml:space="preserve">。网页与 Word 由同一 Markdown 生成。</w:t>
@@ -6176,6 +6653,36 @@
     </w:lvlOverride>
   </w:num>
   <w:num w:numId="1004">
+    <w:abstractNumId w:val="99411"/>
+    <w:lvlOverride w:ilvl="0">
+      <w:startOverride w:val="1"/>
+    </w:lvlOverride>
+    <w:lvlOverride w:ilvl="1">
+      <w:startOverride w:val="1"/>
+    </w:lvlOverride>
+    <w:lvlOverride w:ilvl="2">
+      <w:startOverride w:val="1"/>
+    </w:lvlOverride>
+    <w:lvlOverride w:ilvl="3">
+      <w:startOverride w:val="1"/>
+    </w:lvlOverride>
+    <w:lvlOverride w:ilvl="4">
+      <w:startOverride w:val="1"/>
+    </w:lvlOverride>
+    <w:lvlOverride w:ilvl="5">
+      <w:startOverride w:val="1"/>
+    </w:lvlOverride>
+    <w:lvlOverride w:ilvl="6">
+      <w:startOverride w:val="1"/>
+    </w:lvlOverride>
+    <w:lvlOverride w:ilvl="7">
+      <w:startOverride w:val="1"/>
+    </w:lvlOverride>
+    <w:lvlOverride w:ilvl="8">
+      <w:startOverride w:val="1"/>
+    </w:lvlOverride>
+  </w:num>
+  <w:num w:numId="1005">
     <w:abstractNumId w:val="99411"/>
     <w:lvlOverride w:ilvl="0">
       <w:startOverride w:val="1"/>

</xml_diff>

<commit_message>
Map differential predicted KOs onto original metabolic pathway coordinates with cached previews
</commit_message>
<xml_diff>
--- a/docs/USER_GUIDE.docx
+++ b/docs/USER_GUIDE.docx
@@ -2,7 +2,7 @@
 <file path=word/document.xml><?xml version="1.0" encoding="utf-8"?>
 <w:document xmlns:w="http://schemas.openxmlformats.org/wordprocessingml/2006/main" xmlns:m="http://schemas.openxmlformats.org/officeDocument/2006/math" xmlns:r="http://schemas.openxmlformats.org/officeDocument/2006/relationships" xmlns:o="urn:schemas-microsoft-com:office:office" xmlns:v="urn:schemas-microsoft-com:vml" xmlns:w10="urn:schemas-microsoft-com:office:word" xmlns:a="http://schemas.openxmlformats.org/drawingml/2006/main" xmlns:pic="http://schemas.openxmlformats.org/drawingml/2006/picture" xmlns:wp="http://schemas.openxmlformats.org/drawingml/2006/wordprocessingDrawing">
   <w:body>
-    <w:bookmarkStart w:id="81" w:name="s-分析工作站从第一次打开到解释结果"/>
+    <w:bookmarkStart w:id="85" w:name="s-分析工作站从第一次打开到解释结果"/>
     <w:p>
       <w:pPr>
         <w:pStyle w:val="Heading1"/>
@@ -2942,7 +2942,7 @@
       </w:r>
     </w:p>
     <w:bookmarkEnd w:id="33"/>
-    <w:bookmarkStart w:id="34" w:name="guide-13"/>
+    <w:bookmarkStart w:id="38" w:name="guide-13"/>
     <w:p>
       <w:pPr>
         <w:pStyle w:val="Heading2"/>
@@ -3048,74 +3048,6 @@
         <w:t xml:space="preserve">KEGG L1/L2/L3 或 pathway_id 下的 KO 求和只是注释聚合，不是 MinPath 等方法正式推断的 KEGG 通路丰度、通路完整性或活性。官方 MetaCyc 推断与这些求和需分别命名。当前未请求 stratified/per-sequence 输出，不能从功能总表声称已经得到各菌功能贡献。保存映射来源、版本、原文件 SHA256 和未映射 KO；不因注释名称熟悉就忽视预测不确定性。</w:t>
       </w:r>
     </w:p>
-    <w:bookmarkEnd w:id="34"/>
-    <w:bookmarkStart w:id="35" w:name="guide-14"/>
-    <w:p>
-      <w:pPr>
-        <w:pStyle w:val="Heading2"/>
-      </w:pPr>
-      <w:r>
-        <w:t xml:space="preserve">14. 高级分析：核心菌群、排序与表型关联</w:t>
-      </w:r>
-    </w:p>
-    <w:p>
-      <w:pPr>
-        <w:pStyle w:val="FirstParagraph"/>
-      </w:pPr>
-      <w:r>
-        <w:t xml:space="preserve">高级模块使用可选独立 R 环境</w:t>
-      </w:r>
-      <w:r>
-        <w:t xml:space="preserve"> </w:t>
-      </w:r>
-      <w:r>
-        <w:rPr>
-          <w:rStyle w:val="VerbatimChar"/>
-        </w:rPr>
-        <w:t xml:space="preserve">16s-workstation-advanced</w:t>
-      </w:r>
-      <w:r>
-        <w:t xml:space="preserve">，不改 QIIME 或绘图 R 环境。仅首次使用这些新高级方法时，双击根目录的</w:t>
-      </w:r>
-      <w:r>
-        <w:t xml:space="preserve"> </w:t>
-      </w:r>
-      <w:r>
-        <w:rPr>
-          <w:rStyle w:val="VerbatimChar"/>
-        </w:rPr>
-        <w:t xml:space="preserve">安装高级分析环境.bat</w:t>
-      </w:r>
-      <w:r>
-        <w:t xml:space="preserve"> </w:t>
-      </w:r>
-      <w:r>
-        <w:t xml:space="preserve">联网安装一次；常规分析无需重装。选择已完成预处理结果和 L2—L6 中一个层级，读取其未抽平原始计数；它与基础核心多样性的抽平输入不同。没有对应报告时，不能声称已经完成分析。</w:t>
-      </w:r>
-    </w:p>
-    <w:p>
-      <w:pPr>
-        <w:pStyle w:val="BodyText"/>
-      </w:pPr>
-      <w:r>
-        <w:t xml:space="preserve">附加 metadata CSV 用</w:t>
-      </w:r>
-      <w:r>
-        <w:t xml:space="preserve"> </w:t>
-      </w:r>
-      <w:r>
-        <w:rPr>
-          <w:rStyle w:val="VerbatimChar"/>
-        </w:rPr>
-        <w:t xml:space="preserve">SampleID</w:t>
-      </w:r>
-      <w:r>
-        <w:t xml:space="preserve"> </w:t>
-      </w:r>
-      <w:r>
-        <w:t xml:space="preserve">字面匹配，不能省略本批样本。可含 Age、Sex、Batch、IL6 等列；Group 从原分组补入，若另提供必须一致，额外样本会记录为 ignored。先区分连续量与分类量，数字编码的处理组不是连续表型。缺失值按模型完整案例处理，查看实际样本数；秩亏、共线性和残差自由度不足会阻止推断。</w:t>
-      </w:r>
-    </w:p>
     <w:p>
       <w:pPr>
         <w:pStyle w:val="BodyText"/>
@@ -3125,10 +3057,327 @@
           <w:b/>
           <w:bCs/>
         </w:rPr>
-        <w:t xml:space="preserve">核心菌群与检出率</w:t>
-      </w:r>
-      <w:r>
-        <w:t xml:space="preserve">：默认某样本中计数至少 1 且相对丰度至少 0.01% 才算检出，核心出现率默认 80%，均可调且属启发式。输出全体及分组检出率；检出率是符合条件的样本比例，相对丰度是样本内比例，两者不同。读深、假零、污染与分类层级都会改变结果，须保存阈值、分母及逐样本判定。核心不意味着有益或因果关键。</w:t>
+        <w:t xml:space="preserve">差异预测 KO 在代谢网络中的位置图</w:t>
+      </w:r>
+      <w:r>
+        <w:t xml:space="preserve">：左侧“KO代谢位置图”支持三种独立输入。已有PICRUSt2任务会自动衔接其</w:t>
+      </w:r>
+      <w:r>
+        <w:t xml:space="preserve"> </w:t>
+      </w:r>
+      <w:r>
+        <w:rPr>
+          <w:rStyle w:val="VerbatimChar"/>
+        </w:rPr>
+        <w:t xml:space="preserve">03_tables/KO_abundance.tsv</w:t>
+      </w:r>
+      <w:r>
+        <w:t xml:space="preserve">；也可提供外部KO×样本丰度表与</w:t>
+      </w:r>
+      <w:r>
+        <w:t xml:space="preserve"> </w:t>
+      </w:r>
+      <w:r>
+        <w:rPr>
+          <w:rStyle w:val="VerbatimChar"/>
+        </w:rPr>
+        <w:t xml:space="preserve">SampleID,Group</w:t>
+      </w:r>
+      <w:r>
+        <w:t xml:space="preserve"> </w:t>
+      </w:r>
+      <w:r>
+        <w:t xml:space="preserve">CSV；若已有合适模型的差异结果，可直接导入，不重复计算。丰度允许小数，绝不为套用整数模型而四舍五入。</w:t>
+      </w:r>
+    </w:p>
+    <w:p>
+      <w:pPr>
+        <w:pStyle w:val="BodyText"/>
+      </w:pPr>
+      <w:r>
+        <w:t xml:space="preserve">丰度模式采用探索性的组成数据分析：先按出现率筛选KO，按保留KO总和做TSS，加比例尺度伪计数（默认1e-6），log2后中心化为CLR；对每个KO拟合Group及指定协变量的线性模型，导出全部两两对比。正效应为numerator相对denominator的log2 CLR差值，不是绝对基因拷贝数倍数。BH范围为本次所有可检验KO×比较；出现率、特征子组成与伪计数均影响结果。协变量可指定数值或分类；数字编码批次/性别若按类别调整，应填写在“其中按类别处理的协变量”。独立样本、完整协变量、足够自由度是前提；重复AnimalID/SubjectID、秩亏或不可估计项不会补造P值。复杂配对/纵向模型请在外部完成后导入。</w:t>
+      </w:r>
+    </w:p>
+    <w:p>
+      <w:pPr>
+        <w:pStyle w:val="BodyText"/>
+      </w:pPr>
+      <w:r>
+        <w:t xml:space="preserve">这里的P/q以预测表为条件，没有传播系统发育功能推断误差，也不能替代NSTI评估或实测功能验证。</w:t>
+      </w:r>
+    </w:p>
+    <w:p>
+      <w:pPr>
+        <w:pStyle w:val="BodyText"/>
+      </w:pPr>
+      <w:r>
+        <w:t xml:space="preserve">导入差异表的标准列为</w:t>
+      </w:r>
+      <w:r>
+        <w:t xml:space="preserve"> </w:t>
+      </w:r>
+      <w:r>
+        <w:rPr>
+          <w:rStyle w:val="VerbatimChar"/>
+        </w:rPr>
+        <w:t xml:space="preserve">KO,comparison,numerator,denominator,effect,q</w:t>
+      </w:r>
+      <w:r>
+        <w:t xml:space="preserve">，可另有P；例如以下仅为格式示例，不是实际结果：</w:t>
+      </w:r>
+    </w:p>
+    <w:p>
+      <w:pPr>
+        <w:pStyle w:val="SourceCode"/>
+      </w:pPr>
+      <w:r>
+        <w:rPr>
+          <w:rStyle w:val="VerbatimChar"/>
+        </w:rPr>
+        <w:t xml:space="preserve">KO,comparison,numerator,denominator,effect,q</w:t>
+      </w:r>
+      <w:r>
+        <w:br/>
+      </w:r>
+      <w:r>
+        <w:rPr>
+          <w:rStyle w:val="VerbatimChar"/>
+        </w:rPr>
+        <w:t xml:space="preserve">K00844,TREAT_vs_CON,TREAT,CON,1.2,0.03</w:t>
+      </w:r>
+      <w:r>
+        <w:br/>
+      </w:r>
+      <w:r>
+        <w:rPr>
+          <w:rStyle w:val="VerbatimChar"/>
+        </w:rPr>
+        <w:t xml:space="preserve">K01689,TREAT_vs_CON,TREAT,CON,-0.8,0.02</w:t>
+      </w:r>
+    </w:p>
+    <w:p>
+      <w:pPr>
+        <w:pStyle w:val="FirstParagraph"/>
+      </w:pPr>
+      <w:r>
+        <w:t xml:space="preserve">必须选择原效应尺度（log2FC、log2 CLR差值或原模型estimate）；q需来自原分析的多重校正，不用未校正P冒充。导入模式保留原效应和校正范围，不重新BH。比较名与方向必须一致，同一比较重复KO会拒绝，不猜测哪一条正确。</w:t>
+      </w:r>
+    </w:p>
+    <w:p>
+      <w:pPr>
+        <w:pStyle w:val="BodyText"/>
+      </w:pPr>
+      <w:r>
+        <w:t xml:space="preserve">位置图需要真正的KO版KEGG KGML坐标，原有</w:t>
+      </w:r>
+      <w:r>
+        <w:t xml:space="preserve"> </w:t>
+      </w:r>
+      <w:r>
+        <w:rPr>
+          <w:rStyle w:val="VerbatimChar"/>
+        </w:rPr>
+        <w:t xml:space="preserve">KO,L1,L2,L3...</w:t>
+      </w:r>
+      <w:r>
+        <w:t xml:space="preserve"> </w:t>
+      </w:r>
+      <w:r>
+        <w:t xml:space="preserve">注释表没有坐标，不能替代。默认</w:t>
+      </w:r>
+      <w:r>
+        <w:t xml:space="preserve"> </w:t>
+      </w:r>
+      <w:r>
+        <w:rPr>
+          <w:rStyle w:val="VerbatimChar"/>
+        </w:rPr>
+        <w:t xml:space="preserve">ko01100</w:t>
+      </w:r>
+      <w:r>
+        <w:t xml:space="preserve"> </w:t>
+      </w:r>
+      <w:r>
+        <w:t xml:space="preserve">是全局代谢图，</w:t>
+      </w:r>
+      <w:r>
+        <w:rPr>
+          <w:rStyle w:val="VerbatimChar"/>
+        </w:rPr>
+        <w:t xml:space="preserve">ko00010</w:t>
+      </w:r>
+      <w:r>
+        <w:t xml:space="preserve"> </w:t>
+      </w:r>
+      <w:r>
+        <w:t xml:space="preserve">等对应具体通路。可选择本地KGML；留空尝试从</w:t>
+      </w:r>
+      <w:hyperlink r:id="rId34">
+        <w:r>
+          <w:rPr>
+            <w:rStyle w:val="Hyperlink"/>
+          </w:rPr>
+          <w:t xml:space="preserve">KEGG公共接口</w:t>
+        </w:r>
+      </w:hyperlink>
+      <w:r>
+        <w:t xml:space="preserve">下载，保存来源、时间和SHA256。若WSL网络不能下载，可在Windows浏览器另存KGML后选择该文件；已经完成的KO统计保留，只需从已保存结果重新绘图。图文件编号必须与KGML匹配，不能把任意截图当作可识别KO的地图。KEGG原图数据不随工作站源码分发。</w:t>
+      </w:r>
+    </w:p>
+    <w:p>
+      <w:pPr>
+        <w:pStyle w:val="BodyText"/>
+      </w:pPr>
+      <w:r>
+        <w:t xml:space="preserve">默认正向红、负向蓝、方向混合紫、未命中灰，可逐图修改。多KO共享的图元，只要部分KO通过展示阈值即可标示，但报告会列出完整成员、命中成员和partial标记；这不证明整套复合酶或整个反应活跃。无匹配/无显著KO会明确报告，未映射KO保留，不能随意放到别的位置。图上定位也不等于通路富集检验，更不等于表达、活性、代谢产物或代谢流变化。</w:t>
+      </w:r>
+    </w:p>
+    <w:p>
+      <w:pPr>
+        <w:pStyle w:val="BodyText"/>
+      </w:pPr>
+      <w:r>
+        <w:t xml:space="preserve">统计完成后默认展示首项比较，三组会保存三组对的完整结果；可切换比较再绘图。图片旁可改q/效应展示阈值、颜色、线宽、标签、尺寸和PNG/SVG/PDF导出，读取已保存统计和地图缓存；改变协变量/伪计数/输入数据则应重新计算本项KO分析，不需要重新跑PICRUSt2。</w:t>
+      </w:r>
+      <w:r>
+        <w:rPr>
+          <w:rStyle w:val="VerbatimChar"/>
+        </w:rPr>
+        <w:t xml:space="preserve">02_statistics</w:t>
+      </w:r>
+      <w:r>
+        <w:t xml:space="preserve">保存模型及变换，</w:t>
+      </w:r>
+      <w:r>
+        <w:rPr>
+          <w:rStyle w:val="VerbatimChar"/>
+        </w:rPr>
+        <w:t xml:space="preserve">01_map</w:t>
+      </w:r>
+      <w:r>
+        <w:t xml:space="preserve">保存坐标来源，</w:t>
+      </w:r>
+      <w:r>
+        <w:rPr>
+          <w:rStyle w:val="VerbatimChar"/>
+        </w:rPr>
+        <w:t xml:space="preserve">02_mapping</w:t>
+      </w:r>
+      <w:r>
+        <w:t xml:space="preserve">保存覆盖/共享图元报告。另导出</w:t>
+      </w:r>
+      <w:r>
+        <w:t xml:space="preserve"> </w:t>
+      </w:r>
+      <w:r>
+        <w:rPr>
+          <w:rStyle w:val="VerbatimChar"/>
+        </w:rPr>
+        <w:t xml:space="preserve">ipath_selection.txt</w:t>
+      </w:r>
+      <w:r>
+        <w:t xml:space="preserve">，可由用户自行导入</w:t>
+      </w:r>
+      <w:hyperlink r:id="rId35">
+        <w:r>
+          <w:rPr>
+            <w:rStyle w:val="Hyperlink"/>
+          </w:rPr>
+          <w:t xml:space="preserve">iPath官方全局图</w:t>
+        </w:r>
+      </w:hyperlink>
+      <w:r>
+        <w:t xml:space="preserve">；工作站不会自动上传KO或样本数据。KGML解析参考</w:t>
+      </w:r>
+      <w:hyperlink r:id="rId36">
+        <w:r>
+          <w:rPr>
+            <w:rStyle w:val="Hyperlink"/>
+          </w:rPr>
+          <w:t xml:space="preserve">官方格式</w:t>
+        </w:r>
+      </w:hyperlink>
+      <w:r>
+        <w:t xml:space="preserve">与</w:t>
+      </w:r>
+      <w:hyperlink r:id="rId37">
+        <w:r>
+          <w:rPr>
+            <w:rStyle w:val="Hyperlink"/>
+          </w:rPr>
+          <w:t xml:space="preserve">Biopython KGML实现</w:t>
+        </w:r>
+      </w:hyperlink>
+      <w:r>
+        <w:t xml:space="preserve">。</w:t>
+      </w:r>
+    </w:p>
+    <w:bookmarkEnd w:id="38"/>
+    <w:bookmarkStart w:id="39" w:name="guide-14"/>
+    <w:p>
+      <w:pPr>
+        <w:pStyle w:val="Heading2"/>
+      </w:pPr>
+      <w:r>
+        <w:t xml:space="preserve">14. 高级分析：核心菌群、排序与表型关联</w:t>
+      </w:r>
+    </w:p>
+    <w:p>
+      <w:pPr>
+        <w:pStyle w:val="FirstParagraph"/>
+      </w:pPr>
+      <w:r>
+        <w:t xml:space="preserve">高级模块使用可选独立 R 环境</w:t>
+      </w:r>
+      <w:r>
+        <w:t xml:space="preserve"> </w:t>
+      </w:r>
+      <w:r>
+        <w:rPr>
+          <w:rStyle w:val="VerbatimChar"/>
+        </w:rPr>
+        <w:t xml:space="preserve">16s-workstation-advanced</w:t>
+      </w:r>
+      <w:r>
+        <w:t xml:space="preserve">，不改 QIIME 或绘图 R 环境。仅首次使用这些新高级方法时，双击根目录的</w:t>
+      </w:r>
+      <w:r>
+        <w:t xml:space="preserve"> </w:t>
+      </w:r>
+      <w:r>
+        <w:rPr>
+          <w:rStyle w:val="VerbatimChar"/>
+        </w:rPr>
+        <w:t xml:space="preserve">安装高级分析环境.bat</w:t>
+      </w:r>
+      <w:r>
+        <w:t xml:space="preserve"> </w:t>
+      </w:r>
+      <w:r>
+        <w:t xml:space="preserve">联网安装一次；常规分析无需重装。选择已完成预处理结果和 L2—L6 中一个层级，读取其未抽平原始计数；它与基础核心多样性的抽平输入不同。没有对应报告时，不能声称已经完成分析。</w:t>
+      </w:r>
+    </w:p>
+    <w:p>
+      <w:pPr>
+        <w:pStyle w:val="BodyText"/>
+      </w:pPr>
+      <w:r>
+        <w:t xml:space="preserve">附加 metadata CSV 用</w:t>
+      </w:r>
+      <w:r>
+        <w:t xml:space="preserve"> </w:t>
+      </w:r>
+      <w:r>
+        <w:rPr>
+          <w:rStyle w:val="VerbatimChar"/>
+        </w:rPr>
+        <w:t xml:space="preserve">SampleID</w:t>
+      </w:r>
+      <w:r>
+        <w:t xml:space="preserve"> </w:t>
+      </w:r>
+      <w:r>
+        <w:t xml:space="preserve">字面匹配，不能省略本批样本。可含 Age、Sex、Batch、IL6 等列；Group 从原分组补入，若另提供必须一致，额外样本会记录为 ignored。先区分连续量与分类量，数字编码的处理组不是连续表型。缺失值按模型完整案例处理，查看实际样本数；秩亏、共线性和残差自由度不足会阻止推断。</w:t>
       </w:r>
     </w:p>
     <w:p>
@@ -3140,10 +3389,10 @@
           <w:b/>
           <w:bCs/>
         </w:rPr>
-        <w:t xml:space="preserve">CLR-PCA</w:t>
-      </w:r>
-      <w:r>
-        <w:t xml:space="preserve">：特征筛选默认出现率 10%，CLR 伪计数默认 0.5；在筛选后计数子组成上加伪计数、相对几何均值取对数，再做中心化、不标准化的 PCA[13,19]。相对丰度的分母仍来自原全表，不因展示/筛选重定义。伪计数与保留特征会影响稀有菌，应做敏感性检查。PCA 是描述性探索，载荷方向不等于绝对量变化。</w:t>
+        <w:t xml:space="preserve">核心菌群与检出率</w:t>
+      </w:r>
+      <w:r>
+        <w:t xml:space="preserve">：默认某样本中计数至少 1 且相对丰度至少 0.01% 才算检出，核心出现率默认 80%，均可调且属启发式。输出全体及分组检出率；检出率是符合条件的样本比例，相对丰度是样本内比例，两者不同。读深、假零、污染与分类层级都会改变结果，须保存阈值、分母及逐样本判定。核心不意味着有益或因果关键。</w:t>
       </w:r>
     </w:p>
     <w:p>
@@ -3155,10 +3404,10 @@
           <w:b/>
           <w:bCs/>
         </w:rPr>
-        <w:t xml:space="preserve">PERMANOVA 与离散度</w:t>
-      </w:r>
-      <w:r>
-        <w:t xml:space="preserve">：高级模块对筛选后的相对丰度计算 Bray–Curtis 距离，以 Group 加协变量的边际检验做 PERMANOVA，所检验的模型项构成一族 BH。另做未调整协变量的总体中位中心、偏差调整 PERMDISP，要求各组至少 3 个样本。说明公式、置换与实际样本；位置与离散须分别判断。它与基础抽平距离输入不同，数值无需一致，不能择显著者报告。</w:t>
+        <w:t xml:space="preserve">CLR-PCA</w:t>
+      </w:r>
+      <w:r>
+        <w:t xml:space="preserve">：特征筛选默认出现率 10%，CLR 伪计数默认 0.5；在筛选后计数子组成上加伪计数、相对几何均值取对数，再做中心化、不标准化的 PCA[13,19]。相对丰度的分母仍来自原全表，不因展示/筛选重定义。伪计数与保留特征会影响稀有菌，应做敏感性检查。PCA 是描述性探索，载荷方向不等于绝对量变化。</w:t>
       </w:r>
     </w:p>
     <w:p>
@@ -3170,10 +3419,10 @@
           <w:b/>
           <w:bCs/>
         </w:rPr>
-        <w:t xml:space="preserve">约束排序</w:t>
-      </w:r>
-      <w:r>
-        <w:t xml:space="preserve">：可选 Hellinger-RDA 或 Bray–Curtis dbRDA，解释变量默认 Group，可选控制列，控制项通过条件化处理。Hellinger 对原全表归一后筛选的相对丰度开平方再作线性约束排序，dbRDA 基于距离约束[20]。总体检验与边际项检验分别形成校正范围。报告变量、控制项、完整案例、解释率与置换检验；同批数据的受约束分离不能用作独立分类器验证，箭头也不证明因果。</w:t>
+        <w:t xml:space="preserve">PERMANOVA 与离散度</w:t>
+      </w:r>
+      <w:r>
+        <w:t xml:space="preserve">：高级模块对筛选后的相对丰度计算 Bray–Curtis 距离，以 Group 加协变量的边际检验做 PERMANOVA，所检验的模型项构成一族 BH。另做未调整协变量的总体中位中心、偏差调整 PERMDISP，要求各组至少 3 个样本。说明公式、置换与实际样本；位置与离散须分别判断。它与基础抽平距离输入不同，数值无需一致，不能择显著者报告。</w:t>
       </w:r>
     </w:p>
     <w:p>
@@ -3185,6 +3434,21 @@
           <w:b/>
           <w:bCs/>
         </w:rPr>
+        <w:t xml:space="preserve">约束排序</w:t>
+      </w:r>
+      <w:r>
+        <w:t xml:space="preserve">：可选 Hellinger-RDA 或 Bray–Curtis dbRDA，解释变量默认 Group，可选控制列，控制项通过条件化处理。Hellinger 对原全表归一后筛选的相对丰度开平方再作线性约束排序，dbRDA 基于距离约束[20]。总体检验与边际项检验分别形成校正范围。报告变量、控制项、完整案例、解释率与置换检验；同批数据的受约束分离不能用作独立分类器验证，箭头也不证明因果。</w:t>
+      </w:r>
+    </w:p>
+    <w:p>
+      <w:pPr>
+        <w:pStyle w:val="BodyText"/>
+      </w:pPr>
+      <w:r>
+        <w:rPr>
+          <w:b/>
+          <w:bCs/>
+        </w:rPr>
         <w:t xml:space="preserve">表型关联</w:t>
       </w:r>
       <w:r>
@@ -3250,8 +3514,8 @@
         <w:t xml:space="preserve">保存 PNG/SVG/PDF；图旁控件只读取缓存重绘，不重新拟合。复杂笼位、配对或纵向设计应使用相应外部模型。</w:t>
       </w:r>
     </w:p>
-    <w:bookmarkEnd w:id="35"/>
-    <w:bookmarkStart w:id="36" w:name="guide-15"/>
+    <w:bookmarkEnd w:id="39"/>
+    <w:bookmarkStart w:id="40" w:name="guide-15"/>
     <w:p>
       <w:pPr>
         <w:pStyle w:val="Heading2"/>
@@ -3325,8 +3589,8 @@
         <w:t xml:space="preserve">与参数记录说明来源。改变统计方法、参考组、样本或正式深度属于新的分析，不能靠改图完成。QIIME 原生 QZV 可在 QIIME 2 View 打开，该查看器需联网加载，工作站没有内置完整 QZV 查看器。</w:t>
       </w:r>
     </w:p>
-    <w:bookmarkEnd w:id="36"/>
-    <w:bookmarkStart w:id="37" w:name="guide-16"/>
+    <w:bookmarkEnd w:id="40"/>
+    <w:bookmarkStart w:id="41" w:name="guide-16"/>
     <w:p>
       <w:pPr>
         <w:pStyle w:val="Heading2"/>
@@ -4177,8 +4441,8 @@
         <w:t xml:space="preserve">随机抽平和置换重跑可能不同；不能仅凭源码相同声称逐数值完全复现。论文应报告具体软件版本、实际参数、过滤项、正式深度及丢样、检验与校正范围，而不只写“用工作站默认参数”。保存图片输入表比只保存 PNG 更有助于复核。</w:t>
       </w:r>
     </w:p>
-    <w:bookmarkEnd w:id="37"/>
-    <w:bookmarkStart w:id="38" w:name="guide-17"/>
+    <w:bookmarkEnd w:id="41"/>
+    <w:bookmarkStart w:id="42" w:name="guide-17"/>
     <w:p>
       <w:pPr>
         <w:pStyle w:val="Heading2"/>
@@ -4675,8 +4939,8 @@
         <w:t xml:space="preserve">排错时先找到最早失败的具体命令和错误，保留日志、当前版本与任务目录，再处理相应步骤。不要删除原始数据、关闭 TLS 校验或伪造成功标记来绕过问题。</w:t>
       </w:r>
     </w:p>
-    <w:bookmarkEnd w:id="38"/>
-    <w:bookmarkStart w:id="39" w:name="guide-18"/>
+    <w:bookmarkEnd w:id="42"/>
+    <w:bookmarkStart w:id="43" w:name="guide-18"/>
     <w:p>
       <w:pPr>
         <w:pStyle w:val="Heading2"/>
@@ -5143,8 +5407,8 @@
         </w:tc>
       </w:tr>
     </w:tbl>
-    <w:bookmarkEnd w:id="39"/>
-    <w:bookmarkStart w:id="80" w:name="guide-19"/>
+    <w:bookmarkEnd w:id="43"/>
+    <w:bookmarkStart w:id="84" w:name="guide-19"/>
     <w:p>
       <w:pPr>
         <w:pStyle w:val="Heading2"/>
@@ -5192,7 +5456,7 @@
       <w:r>
         <w:t xml:space="preserve">. Nature Biotechnology, 2019. DOI：</w:t>
       </w:r>
-      <w:hyperlink r:id="rId40">
+      <w:hyperlink r:id="rId44">
         <w:r>
           <w:rPr>
             <w:rStyle w:val="Hyperlink"/>
@@ -5203,7 +5467,7 @@
       <w:r>
         <w:t xml:space="preserve">。</w:t>
       </w:r>
-      <w:hyperlink r:id="rId41">
+      <w:hyperlink r:id="rId45">
         <w:r>
           <w:rPr>
             <w:rStyle w:val="Hyperlink"/>
@@ -5214,7 +5478,7 @@
       <w:r>
         <w:t xml:space="preserve">、</w:t>
       </w:r>
-      <w:hyperlink r:id="rId42">
+      <w:hyperlink r:id="rId46">
         <w:r>
           <w:rPr>
             <w:rStyle w:val="Hyperlink"/>
@@ -5257,7 +5521,7 @@
       <w:r>
         <w:t xml:space="preserve">. Nature Methods, 2016. DOI：</w:t>
       </w:r>
-      <w:hyperlink r:id="rId43">
+      <w:hyperlink r:id="rId47">
         <w:r>
           <w:rPr>
             <w:rStyle w:val="Hyperlink"/>
@@ -5268,7 +5532,7 @@
       <w:r>
         <w:t xml:space="preserve">。</w:t>
       </w:r>
-      <w:hyperlink r:id="rId44">
+      <w:hyperlink r:id="rId48">
         <w:r>
           <w:rPr>
             <w:rStyle w:val="Hyperlink"/>
@@ -5314,7 +5578,7 @@
       <w:r>
         <w:t xml:space="preserve">. The ISME Journal, 2017. DOI：</w:t>
       </w:r>
-      <w:hyperlink r:id="rId45">
+      <w:hyperlink r:id="rId49">
         <w:r>
           <w:rPr>
             <w:rStyle w:val="Hyperlink"/>
@@ -5347,7 +5611,7 @@
       <w:r>
         <w:t xml:space="preserve">QIIME 2 q2-dada2，2025.7.0 官方源码：</w:t>
       </w:r>
-      <w:hyperlink r:id="rId46">
+      <w:hyperlink r:id="rId50">
         <w:r>
           <w:rPr>
             <w:rStyle w:val="Hyperlink"/>
@@ -5358,7 +5622,7 @@
       <w:r>
         <w:t xml:space="preserve">、</w:t>
       </w:r>
-      <w:hyperlink r:id="rId47">
+      <w:hyperlink r:id="rId51">
         <w:r>
           <w:rPr>
             <w:rStyle w:val="Hyperlink"/>
@@ -5372,7 +5636,7 @@
       <w:r>
         <w:t xml:space="preserve"> </w:t>
       </w:r>
-      <w:hyperlink r:id="rId48">
+      <w:hyperlink r:id="rId52">
         <w:r>
           <w:rPr>
             <w:rStyle w:val="Hyperlink"/>
@@ -5418,7 +5682,7 @@
       <w:r>
         <w:t xml:space="preserve">. EMBnet.journal, 2011. DOI：</w:t>
       </w:r>
-      <w:hyperlink r:id="rId49">
+      <w:hyperlink r:id="rId53">
         <w:r>
           <w:rPr>
             <w:rStyle w:val="Hyperlink"/>
@@ -5429,7 +5693,7 @@
       <w:r>
         <w:t xml:space="preserve">。</w:t>
       </w:r>
-      <w:hyperlink r:id="rId50">
+      <w:hyperlink r:id="rId54">
         <w:r>
           <w:rPr>
             <w:rStyle w:val="Hyperlink"/>
@@ -5462,7 +5726,7 @@
       <w:r>
         <w:t xml:space="preserve">QIIME 2 q2-phylogeny：</w:t>
       </w:r>
-      <w:hyperlink r:id="rId51">
+      <w:hyperlink r:id="rId55">
         <w:r>
           <w:rPr>
             <w:rStyle w:val="Hyperlink"/>
@@ -5510,7 +5774,7 @@
       <w:r>
         <w:t xml:space="preserve">scikit-bio：</w:t>
       </w:r>
-      <w:hyperlink r:id="rId52">
+      <w:hyperlink r:id="rId56">
         <w:r>
           <w:rPr>
             <w:rStyle w:val="Hyperlink"/>
@@ -5521,7 +5785,7 @@
       <w:r>
         <w:t xml:space="preserve">。QIIME 2：</w:t>
       </w:r>
-      <w:hyperlink r:id="rId53">
+      <w:hyperlink r:id="rId57">
         <w:r>
           <w:rPr>
             <w:rStyle w:val="Hyperlink"/>
@@ -5532,7 +5796,7 @@
       <w:r>
         <w:t xml:space="preserve">、</w:t>
       </w:r>
-      <w:hyperlink r:id="rId54">
+      <w:hyperlink r:id="rId58">
         <w:r>
           <w:rPr>
             <w:rStyle w:val="Hyperlink"/>
@@ -5578,7 +5842,7 @@
       <w:r>
         <w:t xml:space="preserve">. Frontiers in Microbiology, 2019. DOI：</w:t>
       </w:r>
-      <w:hyperlink r:id="rId55">
+      <w:hyperlink r:id="rId59">
         <w:r>
           <w:rPr>
             <w:rStyle w:val="Hyperlink"/>
@@ -5624,7 +5888,7 @@
       <w:r>
         <w:t xml:space="preserve">. Applied and Environmental Microbiology, 2005. DOI：</w:t>
       </w:r>
-      <w:hyperlink r:id="rId56">
+      <w:hyperlink r:id="rId60">
         <w:r>
           <w:rPr>
             <w:rStyle w:val="Hyperlink"/>
@@ -5657,7 +5921,7 @@
       <w:r>
         <w:t xml:space="preserve">vegan 官方文档：</w:t>
       </w:r>
-      <w:hyperlink r:id="rId57">
+      <w:hyperlink r:id="rId61">
         <w:r>
           <w:rPr>
             <w:rStyle w:val="Hyperlink"/>
@@ -5703,7 +5967,7 @@
       <w:r>
         <w:t xml:space="preserve">. Biometrics, 2006. DOI：</w:t>
       </w:r>
-      <w:hyperlink r:id="rId58">
+      <w:hyperlink r:id="rId62">
         <w:r>
           <w:rPr>
             <w:rStyle w:val="Hyperlink"/>
@@ -5714,7 +5978,7 @@
       <w:r>
         <w:t xml:space="preserve">。</w:t>
       </w:r>
-      <w:hyperlink r:id="rId59">
+      <w:hyperlink r:id="rId63">
         <w:r>
           <w:rPr>
             <w:rStyle w:val="Hyperlink"/>
@@ -5760,7 +6024,7 @@
       <w:r>
         <w:t xml:space="preserve">. Journal of the Royal Statistical Society: Series B, 1995. DOI：</w:t>
       </w:r>
-      <w:hyperlink r:id="rId60">
+      <w:hyperlink r:id="rId64">
         <w:r>
           <w:rPr>
             <w:rStyle w:val="Hyperlink"/>
@@ -5803,7 +6067,7 @@
       <w:r>
         <w:t xml:space="preserve">. Frontiers in Microbiology, 2017. DOI：</w:t>
       </w:r>
-      <w:hyperlink r:id="rId61">
+      <w:hyperlink r:id="rId65">
         <w:r>
           <w:rPr>
             <w:rStyle w:val="Hyperlink"/>
@@ -5849,7 +6113,7 @@
       <w:r>
         <w:t xml:space="preserve">. Nature Methods, 2024. DOI：</w:t>
       </w:r>
-      <w:hyperlink r:id="rId62">
+      <w:hyperlink r:id="rId66">
         <w:r>
           <w:rPr>
             <w:rStyle w:val="Hyperlink"/>
@@ -5860,7 +6124,7 @@
       <w:r>
         <w:t xml:space="preserve">。</w:t>
       </w:r>
-      <w:hyperlink r:id="rId63">
+      <w:hyperlink r:id="rId67">
         <w:r>
           <w:rPr>
             <w:rStyle w:val="Hyperlink"/>
@@ -5903,7 +6167,7 @@
       <w:r>
         <w:t xml:space="preserve">. Microbiome, 2018. DOI：</w:t>
       </w:r>
-      <w:hyperlink r:id="rId64">
+      <w:hyperlink r:id="rId68">
         <w:r>
           <w:rPr>
             <w:rStyle w:val="Hyperlink"/>
@@ -5914,7 +6178,7 @@
       <w:r>
         <w:t xml:space="preserve">。</w:t>
       </w:r>
-      <w:hyperlink r:id="rId65">
+      <w:hyperlink r:id="rId69">
         <w:r>
           <w:rPr>
             <w:rStyle w:val="Hyperlink"/>
@@ -5957,7 +6221,7 @@
       <w:r>
         <w:t xml:space="preserve">. Genome Biology, 2011. DOI：</w:t>
       </w:r>
-      <w:hyperlink r:id="rId66">
+      <w:hyperlink r:id="rId70">
         <w:r>
           <w:rPr>
             <w:rStyle w:val="Hyperlink"/>
@@ -5968,7 +6232,7 @@
       <w:r>
         <w:t xml:space="preserve">。</w:t>
       </w:r>
-      <w:hyperlink r:id="rId67">
+      <w:hyperlink r:id="rId71">
         <w:r>
           <w:rPr>
             <w:rStyle w:val="Hyperlink"/>
@@ -6011,7 +6275,7 @@
       <w:r>
         <w:t xml:space="preserve">. Nature Biotechnology, 2020. DOI：</w:t>
       </w:r>
-      <w:hyperlink r:id="rId68">
+      <w:hyperlink r:id="rId72">
         <w:r>
           <w:rPr>
             <w:rStyle w:val="Hyperlink"/>
@@ -6044,7 +6308,7 @@
       <w:r>
         <w:t xml:space="preserve">PICRUSt2 官方：</w:t>
       </w:r>
-      <w:hyperlink r:id="rId69">
+      <w:hyperlink r:id="rId73">
         <w:r>
           <w:rPr>
             <w:rStyle w:val="Hyperlink"/>
@@ -6055,7 +6319,7 @@
       <w:r>
         <w:t xml:space="preserve">、</w:t>
       </w:r>
-      <w:hyperlink r:id="rId70">
+      <w:hyperlink r:id="rId74">
         <w:r>
           <w:rPr>
             <w:rStyle w:val="Hyperlink"/>
@@ -6066,7 +6330,7 @@
       <w:r>
         <w:t xml:space="preserve">、</w:t>
       </w:r>
-      <w:hyperlink r:id="rId71">
+      <w:hyperlink r:id="rId75">
         <w:r>
           <w:rPr>
             <w:rStyle w:val="Hyperlink"/>
@@ -6080,7 +6344,7 @@
       <w:r>
         <w:t xml:space="preserve"> </w:t>
       </w:r>
-      <w:hyperlink r:id="rId72">
+      <w:hyperlink r:id="rId76">
         <w:r>
           <w:rPr>
             <w:rStyle w:val="Hyperlink"/>
@@ -6126,7 +6390,7 @@
       <w:r>
         <w:t xml:space="preserve">. Journal of the Royal Statistical Society: Series B, 1982. DOI：</w:t>
       </w:r>
-      <w:hyperlink r:id="rId73">
+      <w:hyperlink r:id="rId77">
         <w:r>
           <w:rPr>
             <w:rStyle w:val="Hyperlink"/>
@@ -6172,7 +6436,7 @@
       <w:r>
         <w:t xml:space="preserve">. Oecologia, 2001. DOI：</w:t>
       </w:r>
-      <w:hyperlink r:id="rId74">
+      <w:hyperlink r:id="rId78">
         <w:r>
           <w:rPr>
             <w:rStyle w:val="Hyperlink"/>
@@ -6183,7 +6447,7 @@
       <w:r>
         <w:t xml:space="preserve">。</w:t>
       </w:r>
-      <w:hyperlink r:id="rId75">
+      <w:hyperlink r:id="rId79">
         <w:r>
           <w:rPr>
             <w:rStyle w:val="Hyperlink"/>
@@ -6194,7 +6458,7 @@
       <w:r>
         <w:t xml:space="preserve">、</w:t>
       </w:r>
-      <w:hyperlink r:id="rId76">
+      <w:hyperlink r:id="rId80">
         <w:r>
           <w:rPr>
             <w:rStyle w:val="Hyperlink"/>
@@ -6237,7 +6501,7 @@
       <w:r>
         <w:t xml:space="preserve">. Microbial Ecology in Health and Disease, 2015. DOI：</w:t>
       </w:r>
-      <w:hyperlink r:id="rId77">
+      <w:hyperlink r:id="rId81">
         <w:r>
           <w:rPr>
             <w:rStyle w:val="Hyperlink"/>
@@ -6248,7 +6512,7 @@
       <w:r>
         <w:t xml:space="preserve">。</w:t>
       </w:r>
-      <w:hyperlink r:id="rId78">
+      <w:hyperlink r:id="rId82">
         <w:r>
           <w:rPr>
             <w:rStyle w:val="Hyperlink"/>
@@ -6281,7 +6545,7 @@
       <w:r>
         <w:t xml:space="preserve">ppcor：</w:t>
       </w:r>
-      <w:hyperlink r:id="rId79">
+      <w:hyperlink r:id="rId83">
         <w:r>
           <w:rPr>
             <w:rStyle w:val="Hyperlink"/>
@@ -6311,14 +6575,14 @@
         <w:rPr>
           <w:rStyle w:val="VerbatimChar"/>
         </w:rPr>
-        <w:t xml:space="preserve">df87b65ea9928d08138efdc8c447da053df62e77dc392998173e85e0dfe80352</w:t>
+        <w:t xml:space="preserve">353ea5cb097087c5608a3b52394bd1f96932c92c92814b809a0bfbecdf2b9a8f</w:t>
       </w:r>
       <w:r>
         <w:t xml:space="preserve">。网页与 Word 由同一 Markdown 生成。</w:t>
       </w:r>
     </w:p>
-    <w:bookmarkEnd w:id="80"/>
-    <w:bookmarkEnd w:id="81"/>
+    <w:bookmarkEnd w:id="84"/>
+    <w:bookmarkEnd w:id="85"/>
     <w:sectPr/>
   </w:body>
 </w:document>

</xml_diff>